<commit_message>
Added create pages (commit, issue, repo)
</commit_message>
<xml_diff>
--- a/repo mgmt..docx
+++ b/repo mgmt..docx
@@ -44,7 +44,9 @@
     </w:p>
     <w:p>
       <w:pPr>
-        <w:spacing w:after="0" w:line="360" w:lineRule="auto"/>
+        <w:pStyle w:val="ListParagraph"/>
+        <w:spacing w:after="0" w:line="360" w:lineRule="auto"/>
+        <w:ind w:left="420"/>
         <w:jc w:val="both"/>
         <w:rPr>
           <w:rFonts w:ascii="Times New Roman" w:hAnsi="Times New Roman" w:cs="Times New Roman"/>
@@ -1761,6 +1763,1696 @@
           <w:szCs w:val="24"/>
         </w:rPr>
         <w:t xml:space="preserve"> demonstrates its commitment to developing practical, learning-oriented software solutions aligned with modern web development standards.</w:t>
+      </w:r>
+    </w:p>
+    <w:p>
+      <w:pPr>
+        <w:pStyle w:val="ListParagraph"/>
+        <w:spacing w:after="0" w:line="360" w:lineRule="auto"/>
+        <w:ind w:left="420"/>
+        <w:jc w:val="both"/>
+        <w:rPr>
+          <w:rFonts w:ascii="Times New Roman" w:hAnsi="Times New Roman" w:cs="Times New Roman"/>
+          <w:sz w:val="24"/>
+          <w:szCs w:val="24"/>
+        </w:rPr>
+      </w:pPr>
+    </w:p>
+    <w:p>
+      <w:pPr>
+        <w:pStyle w:val="ListParagraph"/>
+        <w:spacing w:after="0" w:line="360" w:lineRule="auto"/>
+        <w:ind w:left="420"/>
+        <w:jc w:val="both"/>
+        <w:rPr>
+          <w:rFonts w:ascii="Times New Roman" w:hAnsi="Times New Roman" w:cs="Times New Roman"/>
+          <w:sz w:val="24"/>
+          <w:szCs w:val="24"/>
+        </w:rPr>
+      </w:pPr>
+    </w:p>
+    <w:p>
+      <w:pPr>
+        <w:pStyle w:val="ListParagraph"/>
+        <w:spacing w:after="0" w:line="360" w:lineRule="auto"/>
+        <w:ind w:left="420"/>
+        <w:jc w:val="both"/>
+        <w:rPr>
+          <w:rFonts w:ascii="Times New Roman" w:hAnsi="Times New Roman" w:cs="Times New Roman"/>
+          <w:sz w:val="24"/>
+          <w:szCs w:val="24"/>
+        </w:rPr>
+      </w:pPr>
+    </w:p>
+    <w:p>
+      <w:pPr>
+        <w:pStyle w:val="ListParagraph"/>
+        <w:spacing w:after="0" w:line="360" w:lineRule="auto"/>
+        <w:ind w:left="420"/>
+        <w:jc w:val="both"/>
+        <w:rPr>
+          <w:rFonts w:ascii="Times New Roman" w:hAnsi="Times New Roman" w:cs="Times New Roman"/>
+          <w:sz w:val="24"/>
+          <w:szCs w:val="24"/>
+        </w:rPr>
+      </w:pPr>
+    </w:p>
+    <w:p>
+      <w:pPr>
+        <w:pStyle w:val="ListParagraph"/>
+        <w:spacing w:after="0" w:line="360" w:lineRule="auto"/>
+        <w:ind w:left="420"/>
+        <w:jc w:val="both"/>
+        <w:rPr>
+          <w:rFonts w:ascii="Times New Roman" w:hAnsi="Times New Roman" w:cs="Times New Roman"/>
+          <w:sz w:val="24"/>
+          <w:szCs w:val="24"/>
+        </w:rPr>
+      </w:pPr>
+    </w:p>
+    <w:p>
+      <w:pPr>
+        <w:pStyle w:val="ListParagraph"/>
+        <w:spacing w:after="0" w:line="360" w:lineRule="auto"/>
+        <w:ind w:left="420"/>
+        <w:jc w:val="both"/>
+        <w:rPr>
+          <w:rFonts w:ascii="Times New Roman" w:hAnsi="Times New Roman" w:cs="Times New Roman"/>
+          <w:sz w:val="24"/>
+          <w:szCs w:val="24"/>
+        </w:rPr>
+      </w:pPr>
+    </w:p>
+    <w:p>
+      <w:pPr>
+        <w:pStyle w:val="ListParagraph"/>
+        <w:spacing w:after="0" w:line="360" w:lineRule="auto"/>
+        <w:ind w:left="420"/>
+        <w:jc w:val="both"/>
+        <w:rPr>
+          <w:rFonts w:ascii="Times New Roman" w:hAnsi="Times New Roman" w:cs="Times New Roman"/>
+          <w:sz w:val="24"/>
+          <w:szCs w:val="24"/>
+        </w:rPr>
+      </w:pPr>
+    </w:p>
+    <w:p>
+      <w:pPr>
+        <w:pStyle w:val="ListParagraph"/>
+        <w:spacing w:after="0" w:line="360" w:lineRule="auto"/>
+        <w:ind w:left="420"/>
+        <w:jc w:val="both"/>
+        <w:rPr>
+          <w:rFonts w:ascii="Times New Roman" w:hAnsi="Times New Roman" w:cs="Times New Roman"/>
+          <w:sz w:val="24"/>
+          <w:szCs w:val="24"/>
+        </w:rPr>
+      </w:pPr>
+    </w:p>
+    <w:p>
+      <w:pPr>
+        <w:pStyle w:val="ListParagraph"/>
+        <w:spacing w:after="0" w:line="360" w:lineRule="auto"/>
+        <w:ind w:left="420"/>
+        <w:jc w:val="both"/>
+        <w:rPr>
+          <w:rFonts w:ascii="Times New Roman" w:hAnsi="Times New Roman" w:cs="Times New Roman"/>
+          <w:sz w:val="24"/>
+          <w:szCs w:val="24"/>
+        </w:rPr>
+      </w:pPr>
+    </w:p>
+    <w:p>
+      <w:pPr>
+        <w:pStyle w:val="ListParagraph"/>
+        <w:spacing w:after="0" w:line="360" w:lineRule="auto"/>
+        <w:ind w:left="420"/>
+        <w:jc w:val="both"/>
+        <w:rPr>
+          <w:rFonts w:ascii="Times New Roman" w:hAnsi="Times New Roman" w:cs="Times New Roman"/>
+          <w:sz w:val="24"/>
+          <w:szCs w:val="24"/>
+        </w:rPr>
+      </w:pPr>
+    </w:p>
+    <w:p>
+      <w:pPr>
+        <w:pStyle w:val="ListParagraph"/>
+        <w:spacing w:after="0" w:line="360" w:lineRule="auto"/>
+        <w:ind w:left="420"/>
+        <w:jc w:val="both"/>
+        <w:rPr>
+          <w:rFonts w:ascii="Times New Roman" w:hAnsi="Times New Roman" w:cs="Times New Roman"/>
+          <w:sz w:val="24"/>
+          <w:szCs w:val="24"/>
+        </w:rPr>
+      </w:pPr>
+    </w:p>
+    <w:p>
+      <w:pPr>
+        <w:pStyle w:val="ListParagraph"/>
+        <w:spacing w:after="0" w:line="360" w:lineRule="auto"/>
+        <w:ind w:left="420"/>
+        <w:jc w:val="both"/>
+        <w:rPr>
+          <w:rFonts w:ascii="Times New Roman" w:hAnsi="Times New Roman" w:cs="Times New Roman"/>
+          <w:sz w:val="24"/>
+          <w:szCs w:val="24"/>
+        </w:rPr>
+      </w:pPr>
+    </w:p>
+    <w:p>
+      <w:pPr>
+        <w:pStyle w:val="ListParagraph"/>
+        <w:spacing w:after="0" w:line="360" w:lineRule="auto"/>
+        <w:ind w:left="420"/>
+        <w:jc w:val="both"/>
+        <w:rPr>
+          <w:rFonts w:ascii="Times New Roman" w:hAnsi="Times New Roman" w:cs="Times New Roman"/>
+          <w:sz w:val="24"/>
+          <w:szCs w:val="24"/>
+        </w:rPr>
+      </w:pPr>
+    </w:p>
+    <w:p>
+      <w:pPr>
+        <w:spacing w:line="360" w:lineRule="auto"/>
+        <w:jc w:val="both"/>
+        <w:rPr>
+          <w:rFonts w:ascii="Times New Roman" w:hAnsi="Times New Roman" w:cs="Times New Roman"/>
+          <w:sz w:val="24"/>
+          <w:szCs w:val="24"/>
+        </w:rPr>
+      </w:pPr>
+    </w:p>
+    <w:p>
+      <w:pPr>
+        <w:pStyle w:val="ListParagraph"/>
+        <w:spacing w:after="0" w:line="360" w:lineRule="auto"/>
+        <w:ind w:left="420"/>
+        <w:jc w:val="both"/>
+        <w:rPr>
+          <w:rFonts w:ascii="Times New Roman" w:hAnsi="Times New Roman" w:cs="Times New Roman"/>
+          <w:b/>
+          <w:bCs/>
+          <w:sz w:val="28"/>
+          <w:szCs w:val="28"/>
+        </w:rPr>
+      </w:pPr>
+      <w:r>
+        <w:rPr>
+          <w:rFonts w:ascii="Times New Roman" w:hAnsi="Times New Roman" w:cs="Times New Roman"/>
+          <w:b/>
+          <w:bCs/>
+          <w:sz w:val="28"/>
+          <w:szCs w:val="28"/>
+        </w:rPr>
+        <w:lastRenderedPageBreak/>
+        <w:t>2.1 Objectives of the System</w:t>
+      </w:r>
+    </w:p>
+    <w:p>
+      <w:pPr>
+        <w:pStyle w:val="ListParagraph"/>
+        <w:spacing w:after="0" w:line="360" w:lineRule="auto"/>
+        <w:ind w:left="420"/>
+        <w:jc w:val="both"/>
+        <w:rPr>
+          <w:rFonts w:ascii="Times New Roman" w:hAnsi="Times New Roman" w:cs="Times New Roman"/>
+          <w:b/>
+          <w:bCs/>
+          <w:sz w:val="24"/>
+          <w:szCs w:val="24"/>
+        </w:rPr>
+      </w:pPr>
+    </w:p>
+    <w:p>
+      <w:pPr>
+        <w:pStyle w:val="ListParagraph"/>
+        <w:spacing w:after="0" w:line="360" w:lineRule="auto"/>
+        <w:ind w:left="420"/>
+        <w:jc w:val="both"/>
+        <w:rPr>
+          <w:rFonts w:ascii="Times New Roman" w:hAnsi="Times New Roman" w:cs="Times New Roman"/>
+          <w:sz w:val="24"/>
+          <w:szCs w:val="24"/>
+        </w:rPr>
+      </w:pPr>
+      <w:r>
+        <w:rPr>
+          <w:rFonts w:ascii="Times New Roman" w:hAnsi="Times New Roman" w:cs="Times New Roman"/>
+          <w:sz w:val="24"/>
+          <w:szCs w:val="24"/>
+        </w:rPr>
+        <w:t xml:space="preserve">The main objectives of the </w:t>
+      </w:r>
+      <w:proofErr w:type="spellStart"/>
+      <w:r>
+        <w:rPr>
+          <w:rFonts w:ascii="Times New Roman" w:hAnsi="Times New Roman" w:cs="Times New Roman"/>
+          <w:sz w:val="24"/>
+          <w:szCs w:val="24"/>
+        </w:rPr>
+        <w:t>MiniGit</w:t>
+      </w:r>
+      <w:proofErr w:type="spellEnd"/>
+      <w:r>
+        <w:rPr>
+          <w:rFonts w:ascii="Times New Roman" w:hAnsi="Times New Roman" w:cs="Times New Roman"/>
+          <w:sz w:val="24"/>
+          <w:szCs w:val="24"/>
+        </w:rPr>
+        <w:t xml:space="preserve"> system are:</w:t>
+      </w:r>
+    </w:p>
+    <w:p>
+      <w:pPr>
+        <w:pStyle w:val="ListParagraph"/>
+        <w:numPr>
+          <w:ilvl w:val="0"/>
+          <w:numId w:val="36"/>
+        </w:numPr>
+        <w:spacing w:after="0" w:line="360" w:lineRule="auto"/>
+        <w:jc w:val="both"/>
+        <w:rPr>
+          <w:rFonts w:ascii="Times New Roman" w:hAnsi="Times New Roman" w:cs="Times New Roman"/>
+          <w:sz w:val="24"/>
+          <w:szCs w:val="24"/>
+        </w:rPr>
+      </w:pPr>
+      <w:r>
+        <w:rPr>
+          <w:rFonts w:ascii="Times New Roman" w:hAnsi="Times New Roman" w:cs="Times New Roman"/>
+          <w:sz w:val="24"/>
+          <w:szCs w:val="24"/>
+        </w:rPr>
+        <w:t xml:space="preserve">To provide a </w:t>
+      </w:r>
+      <w:r>
+        <w:rPr>
+          <w:rFonts w:ascii="Times New Roman" w:hAnsi="Times New Roman" w:cs="Times New Roman"/>
+          <w:b/>
+          <w:bCs/>
+          <w:sz w:val="24"/>
+          <w:szCs w:val="24"/>
+        </w:rPr>
+        <w:t>user-friendly platform</w:t>
+      </w:r>
+      <w:r>
+        <w:rPr>
+          <w:rFonts w:ascii="Times New Roman" w:hAnsi="Times New Roman" w:cs="Times New Roman"/>
+          <w:sz w:val="24"/>
+          <w:szCs w:val="24"/>
+        </w:rPr>
+        <w:t xml:space="preserve"> for managing repositories without complex Git commands.</w:t>
+      </w:r>
+    </w:p>
+    <w:p>
+      <w:pPr>
+        <w:pStyle w:val="ListParagraph"/>
+        <w:numPr>
+          <w:ilvl w:val="0"/>
+          <w:numId w:val="36"/>
+        </w:numPr>
+        <w:spacing w:after="0" w:line="360" w:lineRule="auto"/>
+        <w:jc w:val="both"/>
+        <w:rPr>
+          <w:rFonts w:ascii="Times New Roman" w:hAnsi="Times New Roman" w:cs="Times New Roman"/>
+          <w:sz w:val="24"/>
+          <w:szCs w:val="24"/>
+        </w:rPr>
+      </w:pPr>
+      <w:r>
+        <w:rPr>
+          <w:rFonts w:ascii="Times New Roman" w:hAnsi="Times New Roman" w:cs="Times New Roman"/>
+          <w:sz w:val="24"/>
+          <w:szCs w:val="24"/>
+        </w:rPr>
+        <w:t xml:space="preserve">To allow users to </w:t>
+      </w:r>
+      <w:r>
+        <w:rPr>
+          <w:rFonts w:ascii="Times New Roman" w:hAnsi="Times New Roman" w:cs="Times New Roman"/>
+          <w:b/>
+          <w:bCs/>
+          <w:sz w:val="24"/>
+          <w:szCs w:val="24"/>
+        </w:rPr>
+        <w:t>explore system features before registration</w:t>
+      </w:r>
+      <w:r>
+        <w:rPr>
+          <w:rFonts w:ascii="Times New Roman" w:hAnsi="Times New Roman" w:cs="Times New Roman"/>
+          <w:sz w:val="24"/>
+          <w:szCs w:val="24"/>
+        </w:rPr>
+        <w:t xml:space="preserve"> through pre-register pages.</w:t>
+      </w:r>
+    </w:p>
+    <w:p>
+      <w:pPr>
+        <w:pStyle w:val="ListParagraph"/>
+        <w:numPr>
+          <w:ilvl w:val="0"/>
+          <w:numId w:val="36"/>
+        </w:numPr>
+        <w:spacing w:after="0" w:line="360" w:lineRule="auto"/>
+        <w:jc w:val="both"/>
+        <w:rPr>
+          <w:rFonts w:ascii="Times New Roman" w:hAnsi="Times New Roman" w:cs="Times New Roman"/>
+          <w:sz w:val="24"/>
+          <w:szCs w:val="24"/>
+        </w:rPr>
+      </w:pPr>
+      <w:r>
+        <w:rPr>
+          <w:rFonts w:ascii="Times New Roman" w:hAnsi="Times New Roman" w:cs="Times New Roman"/>
+          <w:sz w:val="24"/>
+          <w:szCs w:val="24"/>
+        </w:rPr>
+        <w:t xml:space="preserve">To enable registered users to </w:t>
+      </w:r>
+      <w:r>
+        <w:rPr>
+          <w:rFonts w:ascii="Times New Roman" w:hAnsi="Times New Roman" w:cs="Times New Roman"/>
+          <w:b/>
+          <w:bCs/>
+          <w:sz w:val="24"/>
+          <w:szCs w:val="24"/>
+        </w:rPr>
+        <w:t>create, manage, and monitor repositories</w:t>
+      </w:r>
+      <w:r>
+        <w:rPr>
+          <w:rFonts w:ascii="Times New Roman" w:hAnsi="Times New Roman" w:cs="Times New Roman"/>
+          <w:sz w:val="24"/>
+          <w:szCs w:val="24"/>
+        </w:rPr>
+        <w:t xml:space="preserve"> efficiently.</w:t>
+      </w:r>
+    </w:p>
+    <w:p>
+      <w:pPr>
+        <w:pStyle w:val="ListParagraph"/>
+        <w:numPr>
+          <w:ilvl w:val="0"/>
+          <w:numId w:val="36"/>
+        </w:numPr>
+        <w:spacing w:after="0" w:line="360" w:lineRule="auto"/>
+        <w:jc w:val="both"/>
+        <w:rPr>
+          <w:rFonts w:ascii="Times New Roman" w:hAnsi="Times New Roman" w:cs="Times New Roman"/>
+          <w:sz w:val="24"/>
+          <w:szCs w:val="24"/>
+        </w:rPr>
+      </w:pPr>
+      <w:r>
+        <w:rPr>
+          <w:rFonts w:ascii="Times New Roman" w:hAnsi="Times New Roman" w:cs="Times New Roman"/>
+          <w:sz w:val="24"/>
+          <w:szCs w:val="24"/>
+        </w:rPr>
+        <w:t xml:space="preserve">To maintain a clear distinction between </w:t>
+      </w:r>
+      <w:r>
+        <w:rPr>
+          <w:rFonts w:ascii="Times New Roman" w:hAnsi="Times New Roman" w:cs="Times New Roman"/>
+          <w:b/>
+          <w:bCs/>
+          <w:sz w:val="24"/>
+          <w:szCs w:val="24"/>
+        </w:rPr>
+        <w:t>pre-register and post-register functionalities</w:t>
+      </w:r>
+      <w:r>
+        <w:rPr>
+          <w:rFonts w:ascii="Times New Roman" w:hAnsi="Times New Roman" w:cs="Times New Roman"/>
+          <w:sz w:val="24"/>
+          <w:szCs w:val="24"/>
+        </w:rPr>
+        <w:t>.</w:t>
+      </w:r>
+    </w:p>
+    <w:p>
+      <w:pPr>
+        <w:pStyle w:val="ListParagraph"/>
+        <w:numPr>
+          <w:ilvl w:val="0"/>
+          <w:numId w:val="36"/>
+        </w:numPr>
+        <w:spacing w:after="0" w:line="360" w:lineRule="auto"/>
+        <w:jc w:val="both"/>
+        <w:rPr>
+          <w:rFonts w:ascii="Times New Roman" w:hAnsi="Times New Roman" w:cs="Times New Roman"/>
+          <w:sz w:val="24"/>
+          <w:szCs w:val="24"/>
+        </w:rPr>
+      </w:pPr>
+      <w:r>
+        <w:rPr>
+          <w:rFonts w:ascii="Times New Roman" w:hAnsi="Times New Roman" w:cs="Times New Roman"/>
+          <w:sz w:val="24"/>
+          <w:szCs w:val="24"/>
+        </w:rPr>
+        <w:t xml:space="preserve">To provide </w:t>
+      </w:r>
+      <w:r>
+        <w:rPr>
+          <w:rFonts w:ascii="Times New Roman" w:hAnsi="Times New Roman" w:cs="Times New Roman"/>
+          <w:b/>
+          <w:bCs/>
+          <w:sz w:val="24"/>
+          <w:szCs w:val="24"/>
+        </w:rPr>
+        <w:t>secure user authentication and authorization</w:t>
+      </w:r>
+      <w:r>
+        <w:rPr>
+          <w:rFonts w:ascii="Times New Roman" w:hAnsi="Times New Roman" w:cs="Times New Roman"/>
+          <w:sz w:val="24"/>
+          <w:szCs w:val="24"/>
+        </w:rPr>
+        <w:t>.</w:t>
+      </w:r>
+    </w:p>
+    <w:p>
+      <w:pPr>
+        <w:pStyle w:val="ListParagraph"/>
+        <w:numPr>
+          <w:ilvl w:val="0"/>
+          <w:numId w:val="36"/>
+        </w:numPr>
+        <w:spacing w:after="0" w:line="360" w:lineRule="auto"/>
+        <w:jc w:val="both"/>
+        <w:rPr>
+          <w:rFonts w:ascii="Times New Roman" w:hAnsi="Times New Roman" w:cs="Times New Roman"/>
+          <w:sz w:val="24"/>
+          <w:szCs w:val="24"/>
+        </w:rPr>
+      </w:pPr>
+      <w:r>
+        <w:rPr>
+          <w:rFonts w:ascii="Times New Roman" w:hAnsi="Times New Roman" w:cs="Times New Roman"/>
+          <w:sz w:val="24"/>
+          <w:szCs w:val="24"/>
+        </w:rPr>
+        <w:t>To track user activity such as repository updates, commits, and issues.</w:t>
+      </w:r>
+    </w:p>
+    <w:p>
+      <w:pPr>
+        <w:pStyle w:val="ListParagraph"/>
+        <w:numPr>
+          <w:ilvl w:val="0"/>
+          <w:numId w:val="36"/>
+        </w:numPr>
+        <w:spacing w:after="0" w:line="360" w:lineRule="auto"/>
+        <w:jc w:val="both"/>
+        <w:rPr>
+          <w:rFonts w:ascii="Times New Roman" w:hAnsi="Times New Roman" w:cs="Times New Roman"/>
+          <w:sz w:val="24"/>
+          <w:szCs w:val="24"/>
+        </w:rPr>
+      </w:pPr>
+      <w:r>
+        <w:rPr>
+          <w:rFonts w:ascii="Times New Roman" w:hAnsi="Times New Roman" w:cs="Times New Roman"/>
+          <w:sz w:val="24"/>
+          <w:szCs w:val="24"/>
+        </w:rPr>
+        <w:t xml:space="preserve">To offer a </w:t>
+      </w:r>
+      <w:r>
+        <w:rPr>
+          <w:rFonts w:ascii="Times New Roman" w:hAnsi="Times New Roman" w:cs="Times New Roman"/>
+          <w:b/>
+          <w:bCs/>
+          <w:sz w:val="24"/>
+          <w:szCs w:val="24"/>
+        </w:rPr>
+        <w:t>centralized dashboard</w:t>
+      </w:r>
+      <w:r>
+        <w:rPr>
+          <w:rFonts w:ascii="Times New Roman" w:hAnsi="Times New Roman" w:cs="Times New Roman"/>
+          <w:sz w:val="24"/>
+          <w:szCs w:val="24"/>
+        </w:rPr>
+        <w:t xml:space="preserve"> for quick access to recent repositories and activity.</w:t>
+      </w:r>
+    </w:p>
+    <w:p>
+      <w:pPr>
+        <w:pStyle w:val="ListParagraph"/>
+        <w:numPr>
+          <w:ilvl w:val="0"/>
+          <w:numId w:val="36"/>
+        </w:numPr>
+        <w:spacing w:after="0" w:line="360" w:lineRule="auto"/>
+        <w:jc w:val="both"/>
+        <w:rPr>
+          <w:rFonts w:ascii="Times New Roman" w:hAnsi="Times New Roman" w:cs="Times New Roman"/>
+          <w:sz w:val="24"/>
+          <w:szCs w:val="24"/>
+        </w:rPr>
+      </w:pPr>
+      <w:r>
+        <w:rPr>
+          <w:rFonts w:ascii="Times New Roman" w:hAnsi="Times New Roman" w:cs="Times New Roman"/>
+          <w:sz w:val="24"/>
+          <w:szCs w:val="24"/>
+        </w:rPr>
+        <w:t>To support basic collaboration features like issues and commits.</w:t>
+      </w:r>
+    </w:p>
+    <w:p>
+      <w:pPr>
+        <w:pStyle w:val="ListParagraph"/>
+        <w:numPr>
+          <w:ilvl w:val="0"/>
+          <w:numId w:val="36"/>
+        </w:numPr>
+        <w:spacing w:after="0" w:line="360" w:lineRule="auto"/>
+        <w:jc w:val="both"/>
+        <w:rPr>
+          <w:rFonts w:ascii="Times New Roman" w:hAnsi="Times New Roman" w:cs="Times New Roman"/>
+          <w:sz w:val="24"/>
+          <w:szCs w:val="24"/>
+        </w:rPr>
+      </w:pPr>
+      <w:r>
+        <w:rPr>
+          <w:rFonts w:ascii="Times New Roman" w:hAnsi="Times New Roman" w:cs="Times New Roman"/>
+          <w:sz w:val="24"/>
+          <w:szCs w:val="24"/>
+        </w:rPr>
+        <w:t xml:space="preserve">To ensure </w:t>
+      </w:r>
+      <w:r>
+        <w:rPr>
+          <w:rFonts w:ascii="Times New Roman" w:hAnsi="Times New Roman" w:cs="Times New Roman"/>
+          <w:b/>
+          <w:bCs/>
+          <w:sz w:val="24"/>
+          <w:szCs w:val="24"/>
+        </w:rPr>
+        <w:t>data integrity and consistency</w:t>
+      </w:r>
+      <w:r>
+        <w:rPr>
+          <w:rFonts w:ascii="Times New Roman" w:hAnsi="Times New Roman" w:cs="Times New Roman"/>
+          <w:sz w:val="24"/>
+          <w:szCs w:val="24"/>
+        </w:rPr>
+        <w:t xml:space="preserve"> using a structured database.</w:t>
+      </w:r>
+    </w:p>
+    <w:p>
+      <w:pPr>
+        <w:pStyle w:val="ListParagraph"/>
+        <w:numPr>
+          <w:ilvl w:val="0"/>
+          <w:numId w:val="36"/>
+        </w:numPr>
+        <w:spacing w:after="0" w:line="360" w:lineRule="auto"/>
+        <w:jc w:val="both"/>
+        <w:rPr>
+          <w:rFonts w:ascii="Times New Roman" w:hAnsi="Times New Roman" w:cs="Times New Roman"/>
+          <w:sz w:val="24"/>
+          <w:szCs w:val="24"/>
+        </w:rPr>
+      </w:pPr>
+      <w:r>
+        <w:rPr>
+          <w:rFonts w:ascii="Times New Roman" w:hAnsi="Times New Roman" w:cs="Times New Roman"/>
+          <w:sz w:val="24"/>
+          <w:szCs w:val="24"/>
+        </w:rPr>
+        <w:t>To improve productivity for students and beginners learning version control concepts.</w:t>
+      </w:r>
+    </w:p>
+    <w:p>
+      <w:pPr>
+        <w:pStyle w:val="ListParagraph"/>
+        <w:spacing w:line="360" w:lineRule="auto"/>
+        <w:ind w:left="420"/>
+        <w:jc w:val="both"/>
+        <w:rPr>
+          <w:rFonts w:ascii="Times New Roman" w:hAnsi="Times New Roman" w:cs="Times New Roman"/>
+          <w:sz w:val="24"/>
+          <w:szCs w:val="24"/>
+        </w:rPr>
+      </w:pPr>
+    </w:p>
+    <w:p>
+      <w:pPr>
+        <w:pStyle w:val="ListParagraph"/>
+        <w:spacing w:after="0" w:line="360" w:lineRule="auto"/>
+        <w:ind w:left="420"/>
+        <w:jc w:val="both"/>
+        <w:rPr>
+          <w:rFonts w:ascii="Times New Roman" w:hAnsi="Times New Roman" w:cs="Times New Roman"/>
+          <w:b/>
+          <w:bCs/>
+          <w:sz w:val="28"/>
+          <w:szCs w:val="28"/>
+        </w:rPr>
+      </w:pPr>
+      <w:r>
+        <w:rPr>
+          <w:rFonts w:ascii="Times New Roman" w:hAnsi="Times New Roman" w:cs="Times New Roman"/>
+          <w:b/>
+          <w:bCs/>
+          <w:sz w:val="28"/>
+          <w:szCs w:val="28"/>
+        </w:rPr>
+        <w:t>2.2 Software Requirement Specification (SRS)</w:t>
+      </w:r>
+    </w:p>
+    <w:p>
+      <w:pPr>
+        <w:pStyle w:val="ListParagraph"/>
+        <w:spacing w:after="0" w:line="360" w:lineRule="auto"/>
+        <w:ind w:left="420"/>
+        <w:jc w:val="both"/>
+        <w:rPr>
+          <w:rFonts w:ascii="Times New Roman" w:hAnsi="Times New Roman" w:cs="Times New Roman"/>
+          <w:b/>
+          <w:bCs/>
+          <w:sz w:val="24"/>
+          <w:szCs w:val="24"/>
+        </w:rPr>
+      </w:pPr>
+      <w:r>
+        <w:rPr>
+          <w:rFonts w:ascii="Times New Roman" w:hAnsi="Times New Roman" w:cs="Times New Roman"/>
+          <w:b/>
+          <w:bCs/>
+          <w:sz w:val="24"/>
+          <w:szCs w:val="24"/>
+        </w:rPr>
+        <w:t>2.2.1 Introduction</w:t>
+      </w:r>
+    </w:p>
+    <w:p>
+      <w:pPr>
+        <w:pStyle w:val="ListParagraph"/>
+        <w:spacing w:after="0" w:line="360" w:lineRule="auto"/>
+        <w:ind w:left="420"/>
+        <w:jc w:val="both"/>
+        <w:rPr>
+          <w:rFonts w:ascii="Times New Roman" w:hAnsi="Times New Roman" w:cs="Times New Roman"/>
+          <w:b/>
+          <w:bCs/>
+          <w:sz w:val="24"/>
+          <w:szCs w:val="24"/>
+        </w:rPr>
+      </w:pPr>
+      <w:r>
+        <w:rPr>
+          <w:rFonts w:ascii="Times New Roman" w:hAnsi="Times New Roman" w:cs="Times New Roman"/>
+          <w:b/>
+          <w:bCs/>
+          <w:sz w:val="24"/>
+          <w:szCs w:val="24"/>
+        </w:rPr>
+        <w:t>Purpose</w:t>
+      </w:r>
+    </w:p>
+    <w:p>
+      <w:pPr>
+        <w:pStyle w:val="ListParagraph"/>
+        <w:spacing w:after="0" w:line="360" w:lineRule="auto"/>
+        <w:ind w:left="420"/>
+        <w:jc w:val="both"/>
+        <w:rPr>
+          <w:rFonts w:ascii="Times New Roman" w:hAnsi="Times New Roman" w:cs="Times New Roman"/>
+          <w:sz w:val="24"/>
+          <w:szCs w:val="24"/>
+        </w:rPr>
+      </w:pPr>
+      <w:r>
+        <w:rPr>
+          <w:rFonts w:ascii="Times New Roman" w:hAnsi="Times New Roman" w:cs="Times New Roman"/>
+          <w:sz w:val="24"/>
+          <w:szCs w:val="24"/>
+        </w:rPr>
+        <w:t xml:space="preserve">This </w:t>
+      </w:r>
+      <w:r>
+        <w:rPr>
+          <w:rFonts w:ascii="Times New Roman" w:hAnsi="Times New Roman" w:cs="Times New Roman"/>
+          <w:sz w:val="24"/>
+          <w:szCs w:val="24"/>
+        </w:rPr>
+        <w:t>section</w:t>
+      </w:r>
+      <w:r>
+        <w:rPr>
+          <w:rFonts w:ascii="Times New Roman" w:hAnsi="Times New Roman" w:cs="Times New Roman"/>
+          <w:sz w:val="24"/>
+          <w:szCs w:val="24"/>
+        </w:rPr>
+        <w:t xml:space="preserve"> defines the software requirements of </w:t>
+      </w:r>
+      <w:proofErr w:type="spellStart"/>
+      <w:r>
+        <w:rPr>
+          <w:rFonts w:ascii="Times New Roman" w:hAnsi="Times New Roman" w:cs="Times New Roman"/>
+          <w:sz w:val="24"/>
+          <w:szCs w:val="24"/>
+        </w:rPr>
+        <w:t>MiniGit</w:t>
+      </w:r>
+      <w:proofErr w:type="spellEnd"/>
+      <w:r>
+        <w:rPr>
+          <w:rFonts w:ascii="Times New Roman" w:hAnsi="Times New Roman" w:cs="Times New Roman"/>
+          <w:sz w:val="24"/>
+          <w:szCs w:val="24"/>
+        </w:rPr>
+        <w:t>, a web-based repository management system that provides basic version control features through a simple and user-friendly interface.</w:t>
+      </w:r>
+    </w:p>
+    <w:p>
+      <w:pPr>
+        <w:pStyle w:val="ListParagraph"/>
+        <w:spacing w:after="0" w:line="360" w:lineRule="auto"/>
+        <w:ind w:left="420"/>
+        <w:jc w:val="both"/>
+        <w:rPr>
+          <w:rFonts w:ascii="Times New Roman" w:hAnsi="Times New Roman" w:cs="Times New Roman"/>
+          <w:b/>
+          <w:bCs/>
+          <w:sz w:val="24"/>
+          <w:szCs w:val="24"/>
+        </w:rPr>
+      </w:pPr>
+      <w:r>
+        <w:rPr>
+          <w:rFonts w:ascii="Times New Roman" w:hAnsi="Times New Roman" w:cs="Times New Roman"/>
+          <w:b/>
+          <w:bCs/>
+          <w:sz w:val="24"/>
+          <w:szCs w:val="24"/>
+        </w:rPr>
+        <w:t>Scope</w:t>
+      </w:r>
+    </w:p>
+    <w:p>
+      <w:pPr>
+        <w:pStyle w:val="ListParagraph"/>
+        <w:spacing w:after="0" w:line="360" w:lineRule="auto"/>
+        <w:ind w:left="420"/>
+        <w:jc w:val="both"/>
+        <w:rPr>
+          <w:rFonts w:ascii="Times New Roman" w:hAnsi="Times New Roman" w:cs="Times New Roman"/>
+          <w:sz w:val="24"/>
+          <w:szCs w:val="24"/>
+        </w:rPr>
+      </w:pPr>
+      <w:proofErr w:type="spellStart"/>
+      <w:r>
+        <w:rPr>
+          <w:rFonts w:ascii="Times New Roman" w:hAnsi="Times New Roman" w:cs="Times New Roman"/>
+          <w:sz w:val="24"/>
+          <w:szCs w:val="24"/>
+        </w:rPr>
+        <w:t>MiniGit</w:t>
+      </w:r>
+      <w:proofErr w:type="spellEnd"/>
+      <w:r>
+        <w:rPr>
+          <w:rFonts w:ascii="Times New Roman" w:hAnsi="Times New Roman" w:cs="Times New Roman"/>
+          <w:sz w:val="24"/>
+          <w:szCs w:val="24"/>
+        </w:rPr>
+        <w:t xml:space="preserve"> allows users to explore system features publicly and perform repository-related operations such as creating repositories, commits, and issues after authentication.</w:t>
+      </w:r>
+    </w:p>
+    <w:p>
+      <w:pPr>
+        <w:pStyle w:val="ListParagraph"/>
+        <w:spacing w:line="360" w:lineRule="auto"/>
+        <w:ind w:left="420"/>
+        <w:jc w:val="both"/>
+        <w:rPr>
+          <w:rFonts w:ascii="Times New Roman" w:hAnsi="Times New Roman" w:cs="Times New Roman"/>
+          <w:b/>
+          <w:bCs/>
+          <w:sz w:val="24"/>
+          <w:szCs w:val="24"/>
+        </w:rPr>
+      </w:pPr>
+    </w:p>
+    <w:p>
+      <w:pPr>
+        <w:pStyle w:val="ListParagraph"/>
+        <w:spacing w:after="0" w:line="360" w:lineRule="auto"/>
+        <w:ind w:left="420"/>
+        <w:jc w:val="both"/>
+        <w:rPr>
+          <w:rFonts w:ascii="Times New Roman" w:hAnsi="Times New Roman" w:cs="Times New Roman"/>
+          <w:b/>
+          <w:bCs/>
+          <w:sz w:val="24"/>
+          <w:szCs w:val="24"/>
+        </w:rPr>
+      </w:pPr>
+      <w:r>
+        <w:rPr>
+          <w:rFonts w:ascii="Times New Roman" w:hAnsi="Times New Roman" w:cs="Times New Roman"/>
+          <w:b/>
+          <w:bCs/>
+          <w:sz w:val="24"/>
+          <w:szCs w:val="24"/>
+        </w:rPr>
+        <w:t>2.2.2 Overall Description</w:t>
+      </w:r>
+    </w:p>
+    <w:p>
+      <w:pPr>
+        <w:pStyle w:val="ListParagraph"/>
+        <w:spacing w:after="0" w:line="360" w:lineRule="auto"/>
+        <w:ind w:left="420"/>
+        <w:jc w:val="both"/>
+        <w:rPr>
+          <w:rFonts w:ascii="Times New Roman" w:hAnsi="Times New Roman" w:cs="Times New Roman"/>
+          <w:b/>
+          <w:bCs/>
+          <w:sz w:val="24"/>
+          <w:szCs w:val="24"/>
+        </w:rPr>
+      </w:pPr>
+      <w:r>
+        <w:rPr>
+          <w:rFonts w:ascii="Times New Roman" w:hAnsi="Times New Roman" w:cs="Times New Roman"/>
+          <w:b/>
+          <w:bCs/>
+          <w:sz w:val="24"/>
+          <w:szCs w:val="24"/>
+        </w:rPr>
+        <w:t>Product Overview</w:t>
+      </w:r>
+    </w:p>
+    <w:p>
+      <w:pPr>
+        <w:pStyle w:val="ListParagraph"/>
+        <w:spacing w:after="0" w:line="360" w:lineRule="auto"/>
+        <w:ind w:left="420"/>
+        <w:jc w:val="both"/>
+        <w:rPr>
+          <w:rFonts w:ascii="Times New Roman" w:hAnsi="Times New Roman" w:cs="Times New Roman"/>
+          <w:sz w:val="24"/>
+          <w:szCs w:val="24"/>
+        </w:rPr>
+      </w:pPr>
+      <w:proofErr w:type="spellStart"/>
+      <w:r>
+        <w:rPr>
+          <w:rFonts w:ascii="Times New Roman" w:hAnsi="Times New Roman" w:cs="Times New Roman"/>
+          <w:sz w:val="24"/>
+          <w:szCs w:val="24"/>
+        </w:rPr>
+        <w:t>MiniGit</w:t>
+      </w:r>
+      <w:proofErr w:type="spellEnd"/>
+      <w:r>
+        <w:rPr>
+          <w:rFonts w:ascii="Times New Roman" w:hAnsi="Times New Roman" w:cs="Times New Roman"/>
+          <w:sz w:val="24"/>
+          <w:szCs w:val="24"/>
+        </w:rPr>
+        <w:t xml:space="preserve"> is developed using HTML, CSS, JavaScript for the frontend and Python (Flask) with MySQL for the backend database.</w:t>
+      </w:r>
+    </w:p>
+    <w:p>
+      <w:pPr>
+        <w:pStyle w:val="ListParagraph"/>
+        <w:spacing w:after="0" w:line="360" w:lineRule="auto"/>
+        <w:ind w:left="420"/>
+        <w:jc w:val="both"/>
+        <w:rPr>
+          <w:rFonts w:ascii="Times New Roman" w:hAnsi="Times New Roman" w:cs="Times New Roman"/>
+          <w:sz w:val="24"/>
+          <w:szCs w:val="24"/>
+        </w:rPr>
+      </w:pPr>
+    </w:p>
+    <w:p>
+      <w:pPr>
+        <w:pStyle w:val="ListParagraph"/>
+        <w:spacing w:after="0" w:line="360" w:lineRule="auto"/>
+        <w:ind w:left="420"/>
+        <w:jc w:val="both"/>
+        <w:rPr>
+          <w:rFonts w:ascii="Times New Roman" w:hAnsi="Times New Roman" w:cs="Times New Roman"/>
+          <w:sz w:val="24"/>
+          <w:szCs w:val="24"/>
+        </w:rPr>
+      </w:pPr>
+    </w:p>
+    <w:p>
+      <w:pPr>
+        <w:pStyle w:val="ListParagraph"/>
+        <w:spacing w:after="0" w:line="360" w:lineRule="auto"/>
+        <w:ind w:left="420"/>
+        <w:jc w:val="both"/>
+        <w:rPr>
+          <w:rFonts w:ascii="Times New Roman" w:hAnsi="Times New Roman" w:cs="Times New Roman"/>
+          <w:sz w:val="24"/>
+          <w:szCs w:val="24"/>
+        </w:rPr>
+      </w:pPr>
+    </w:p>
+    <w:p>
+      <w:pPr>
+        <w:pStyle w:val="ListParagraph"/>
+        <w:spacing w:after="0" w:line="360" w:lineRule="auto"/>
+        <w:ind w:left="420"/>
+        <w:jc w:val="both"/>
+        <w:rPr>
+          <w:rFonts w:ascii="Times New Roman" w:hAnsi="Times New Roman" w:cs="Times New Roman"/>
+          <w:sz w:val="24"/>
+          <w:szCs w:val="24"/>
+        </w:rPr>
+      </w:pPr>
+      <w:r>
+        <w:rPr>
+          <w:rFonts w:ascii="Times New Roman" w:hAnsi="Times New Roman" w:cs="Times New Roman"/>
+          <w:sz w:val="24"/>
+          <w:szCs w:val="24"/>
+        </w:rPr>
+        <w:lastRenderedPageBreak/>
+        <w:t>User Types</w:t>
+      </w:r>
+    </w:p>
+    <w:tbl>
+      <w:tblPr>
+        <w:tblW w:w="0" w:type="auto"/>
+        <w:tblCellSpacing w:w="15" w:type="dxa"/>
+        <w:tblBorders>
+          <w:top w:val="single" w:sz="4" w:space="0" w:color="auto"/>
+          <w:left w:val="single" w:sz="4" w:space="0" w:color="auto"/>
+          <w:bottom w:val="single" w:sz="4" w:space="0" w:color="auto"/>
+          <w:right w:val="single" w:sz="4" w:space="0" w:color="auto"/>
+          <w:insideH w:val="single" w:sz="4" w:space="0" w:color="auto"/>
+          <w:insideV w:val="single" w:sz="4" w:space="0" w:color="auto"/>
+        </w:tblBorders>
+        <w:tblCellMar>
+          <w:top w:w="15" w:type="dxa"/>
+          <w:left w:w="15" w:type="dxa"/>
+          <w:bottom w:w="15" w:type="dxa"/>
+          <w:right w:w="15" w:type="dxa"/>
+        </w:tblCellMar>
+        <w:tblLook w:val="04A0" w:firstRow="1" w:lastRow="0" w:firstColumn="1" w:lastColumn="0" w:noHBand="0" w:noVBand="1"/>
+      </w:tblPr>
+      <w:tblGrid>
+        <w:gridCol w:w="2055"/>
+        <w:gridCol w:w="4668"/>
+      </w:tblGrid>
+      <w:tr>
+        <w:trPr>
+          <w:tblHeader/>
+          <w:tblCellSpacing w:w="15" w:type="dxa"/>
+        </w:trPr>
+        <w:tc>
+          <w:tcPr>
+            <w:tcW w:w="0" w:type="auto"/>
+            <w:vAlign w:val="center"/>
+            <w:hideMark/>
+          </w:tcPr>
+          <w:p>
+            <w:pPr>
+              <w:pStyle w:val="ListParagraph"/>
+              <w:spacing w:line="360" w:lineRule="auto"/>
+              <w:ind w:left="420"/>
+              <w:jc w:val="both"/>
+              <w:rPr>
+                <w:rFonts w:ascii="Times New Roman" w:hAnsi="Times New Roman" w:cs="Times New Roman"/>
+                <w:sz w:val="24"/>
+                <w:szCs w:val="24"/>
+              </w:rPr>
+            </w:pPr>
+            <w:r>
+              <w:rPr>
+                <w:rFonts w:ascii="Times New Roman" w:hAnsi="Times New Roman" w:cs="Times New Roman"/>
+                <w:sz w:val="24"/>
+                <w:szCs w:val="24"/>
+              </w:rPr>
+              <w:t>User</w:t>
+            </w:r>
+          </w:p>
+        </w:tc>
+        <w:tc>
+          <w:tcPr>
+            <w:tcW w:w="0" w:type="auto"/>
+            <w:vAlign w:val="center"/>
+            <w:hideMark/>
+          </w:tcPr>
+          <w:p>
+            <w:pPr>
+              <w:pStyle w:val="ListParagraph"/>
+              <w:spacing w:line="360" w:lineRule="auto"/>
+              <w:ind w:left="420"/>
+              <w:jc w:val="both"/>
+              <w:rPr>
+                <w:rFonts w:ascii="Times New Roman" w:hAnsi="Times New Roman" w:cs="Times New Roman"/>
+                <w:sz w:val="24"/>
+                <w:szCs w:val="24"/>
+              </w:rPr>
+            </w:pPr>
+            <w:r>
+              <w:rPr>
+                <w:rFonts w:ascii="Times New Roman" w:hAnsi="Times New Roman" w:cs="Times New Roman"/>
+                <w:sz w:val="24"/>
+                <w:szCs w:val="24"/>
+              </w:rPr>
+              <w:t>Description</w:t>
+            </w:r>
+          </w:p>
+        </w:tc>
+      </w:tr>
+      <w:tr>
+        <w:trPr>
+          <w:tblCellSpacing w:w="15" w:type="dxa"/>
+        </w:trPr>
+        <w:tc>
+          <w:tcPr>
+            <w:tcW w:w="0" w:type="auto"/>
+            <w:vAlign w:val="center"/>
+            <w:hideMark/>
+          </w:tcPr>
+          <w:p>
+            <w:pPr>
+              <w:pStyle w:val="ListParagraph"/>
+              <w:spacing w:line="360" w:lineRule="auto"/>
+              <w:ind w:left="420"/>
+              <w:jc w:val="both"/>
+              <w:rPr>
+                <w:rFonts w:ascii="Times New Roman" w:hAnsi="Times New Roman" w:cs="Times New Roman"/>
+                <w:sz w:val="24"/>
+                <w:szCs w:val="24"/>
+              </w:rPr>
+            </w:pPr>
+            <w:r>
+              <w:rPr>
+                <w:rFonts w:ascii="Times New Roman" w:hAnsi="Times New Roman" w:cs="Times New Roman"/>
+                <w:sz w:val="24"/>
+                <w:szCs w:val="24"/>
+              </w:rPr>
+              <w:t>Public User</w:t>
+            </w:r>
+          </w:p>
+        </w:tc>
+        <w:tc>
+          <w:tcPr>
+            <w:tcW w:w="0" w:type="auto"/>
+            <w:vAlign w:val="center"/>
+            <w:hideMark/>
+          </w:tcPr>
+          <w:p>
+            <w:pPr>
+              <w:pStyle w:val="ListParagraph"/>
+              <w:spacing w:line="360" w:lineRule="auto"/>
+              <w:ind w:left="420"/>
+              <w:jc w:val="both"/>
+              <w:rPr>
+                <w:rFonts w:ascii="Times New Roman" w:hAnsi="Times New Roman" w:cs="Times New Roman"/>
+                <w:sz w:val="24"/>
+                <w:szCs w:val="24"/>
+              </w:rPr>
+            </w:pPr>
+            <w:r>
+              <w:rPr>
+                <w:rFonts w:ascii="Times New Roman" w:hAnsi="Times New Roman" w:cs="Times New Roman"/>
+                <w:sz w:val="24"/>
+                <w:szCs w:val="24"/>
+              </w:rPr>
+              <w:t>Can view information and submit feedback</w:t>
+            </w:r>
+          </w:p>
+        </w:tc>
+      </w:tr>
+      <w:tr>
+        <w:trPr>
+          <w:tblCellSpacing w:w="15" w:type="dxa"/>
+        </w:trPr>
+        <w:tc>
+          <w:tcPr>
+            <w:tcW w:w="0" w:type="auto"/>
+            <w:vAlign w:val="center"/>
+            <w:hideMark/>
+          </w:tcPr>
+          <w:p>
+            <w:pPr>
+              <w:pStyle w:val="ListParagraph"/>
+              <w:spacing w:line="360" w:lineRule="auto"/>
+              <w:ind w:left="420"/>
+              <w:jc w:val="both"/>
+              <w:rPr>
+                <w:rFonts w:ascii="Times New Roman" w:hAnsi="Times New Roman" w:cs="Times New Roman"/>
+                <w:sz w:val="24"/>
+                <w:szCs w:val="24"/>
+              </w:rPr>
+            </w:pPr>
+            <w:r>
+              <w:rPr>
+                <w:rFonts w:ascii="Times New Roman" w:hAnsi="Times New Roman" w:cs="Times New Roman"/>
+                <w:sz w:val="24"/>
+                <w:szCs w:val="24"/>
+              </w:rPr>
+              <w:t>Registered User</w:t>
+            </w:r>
+          </w:p>
+        </w:tc>
+        <w:tc>
+          <w:tcPr>
+            <w:tcW w:w="0" w:type="auto"/>
+            <w:vAlign w:val="center"/>
+            <w:hideMark/>
+          </w:tcPr>
+          <w:p>
+            <w:pPr>
+              <w:pStyle w:val="ListParagraph"/>
+              <w:spacing w:line="360" w:lineRule="auto"/>
+              <w:ind w:left="420"/>
+              <w:jc w:val="both"/>
+              <w:rPr>
+                <w:rFonts w:ascii="Times New Roman" w:hAnsi="Times New Roman" w:cs="Times New Roman"/>
+                <w:sz w:val="24"/>
+                <w:szCs w:val="24"/>
+              </w:rPr>
+            </w:pPr>
+            <w:r>
+              <w:rPr>
+                <w:rFonts w:ascii="Times New Roman" w:hAnsi="Times New Roman" w:cs="Times New Roman"/>
+                <w:sz w:val="24"/>
+                <w:szCs w:val="24"/>
+              </w:rPr>
+              <w:t>Can manage repositories and activities</w:t>
+            </w:r>
+          </w:p>
+        </w:tc>
+      </w:tr>
+    </w:tbl>
+    <w:p>
+      <w:pPr>
+        <w:pStyle w:val="ListParagraph"/>
+        <w:spacing w:line="360" w:lineRule="auto"/>
+        <w:ind w:left="420"/>
+        <w:jc w:val="both"/>
+        <w:rPr>
+          <w:rFonts w:ascii="Times New Roman" w:hAnsi="Times New Roman" w:cs="Times New Roman"/>
+          <w:b/>
+          <w:bCs/>
+          <w:sz w:val="24"/>
+          <w:szCs w:val="24"/>
+        </w:rPr>
+      </w:pPr>
+    </w:p>
+    <w:p>
+      <w:pPr>
+        <w:pStyle w:val="ListParagraph"/>
+        <w:spacing w:after="0" w:line="360" w:lineRule="auto"/>
+        <w:ind w:left="420"/>
+        <w:jc w:val="both"/>
+        <w:rPr>
+          <w:rFonts w:ascii="Times New Roman" w:hAnsi="Times New Roman" w:cs="Times New Roman"/>
+          <w:b/>
+          <w:bCs/>
+          <w:sz w:val="24"/>
+          <w:szCs w:val="24"/>
+        </w:rPr>
+      </w:pPr>
+      <w:r>
+        <w:rPr>
+          <w:rFonts w:ascii="Times New Roman" w:hAnsi="Times New Roman" w:cs="Times New Roman"/>
+          <w:b/>
+          <w:bCs/>
+          <w:sz w:val="24"/>
+          <w:szCs w:val="24"/>
+        </w:rPr>
+        <w:t>2.2.3 Functional Requirements</w:t>
+      </w:r>
+    </w:p>
+    <w:p>
+      <w:pPr>
+        <w:pStyle w:val="ListParagraph"/>
+        <w:spacing w:after="0" w:line="360" w:lineRule="auto"/>
+        <w:ind w:left="420"/>
+        <w:jc w:val="both"/>
+        <w:rPr>
+          <w:rFonts w:ascii="Times New Roman" w:hAnsi="Times New Roman" w:cs="Times New Roman"/>
+          <w:b/>
+          <w:bCs/>
+          <w:sz w:val="24"/>
+          <w:szCs w:val="24"/>
+        </w:rPr>
+      </w:pPr>
+      <w:r>
+        <w:rPr>
+          <w:rFonts w:ascii="Times New Roman" w:hAnsi="Times New Roman" w:cs="Times New Roman"/>
+          <w:b/>
+          <w:bCs/>
+          <w:sz w:val="24"/>
+          <w:szCs w:val="24"/>
+        </w:rPr>
+        <w:t>A. Public User Requirements</w:t>
+      </w:r>
+    </w:p>
+    <w:p>
+      <w:pPr>
+        <w:pStyle w:val="ListParagraph"/>
+        <w:numPr>
+          <w:ilvl w:val="0"/>
+          <w:numId w:val="41"/>
+        </w:numPr>
+        <w:spacing w:after="0" w:line="360" w:lineRule="auto"/>
+        <w:jc w:val="both"/>
+        <w:rPr>
+          <w:rFonts w:ascii="Times New Roman" w:hAnsi="Times New Roman" w:cs="Times New Roman"/>
+          <w:sz w:val="24"/>
+          <w:szCs w:val="24"/>
+        </w:rPr>
+      </w:pPr>
+      <w:r>
+        <w:rPr>
+          <w:rFonts w:ascii="Times New Roman" w:hAnsi="Times New Roman" w:cs="Times New Roman"/>
+          <w:sz w:val="24"/>
+          <w:szCs w:val="24"/>
+        </w:rPr>
+        <w:t>The system shall display home, features, demo, privacy policy, and help pages.</w:t>
+      </w:r>
+    </w:p>
+    <w:p>
+      <w:pPr>
+        <w:pStyle w:val="ListParagraph"/>
+        <w:numPr>
+          <w:ilvl w:val="0"/>
+          <w:numId w:val="41"/>
+        </w:numPr>
+        <w:spacing w:after="0" w:line="360" w:lineRule="auto"/>
+        <w:jc w:val="both"/>
+        <w:rPr>
+          <w:rFonts w:ascii="Times New Roman" w:hAnsi="Times New Roman" w:cs="Times New Roman"/>
+          <w:sz w:val="24"/>
+          <w:szCs w:val="24"/>
+        </w:rPr>
+      </w:pPr>
+      <w:r>
+        <w:rPr>
+          <w:rFonts w:ascii="Times New Roman" w:hAnsi="Times New Roman" w:cs="Times New Roman"/>
+          <w:sz w:val="24"/>
+          <w:szCs w:val="24"/>
+        </w:rPr>
+        <w:t>The system shall allow users to submit feedback.</w:t>
+      </w:r>
+    </w:p>
+    <w:p>
+      <w:pPr>
+        <w:pStyle w:val="ListParagraph"/>
+        <w:numPr>
+          <w:ilvl w:val="0"/>
+          <w:numId w:val="41"/>
+        </w:numPr>
+        <w:spacing w:after="0" w:line="360" w:lineRule="auto"/>
+        <w:jc w:val="both"/>
+        <w:rPr>
+          <w:rFonts w:ascii="Times New Roman" w:hAnsi="Times New Roman" w:cs="Times New Roman"/>
+          <w:sz w:val="24"/>
+          <w:szCs w:val="24"/>
+        </w:rPr>
+      </w:pPr>
+      <w:r>
+        <w:rPr>
+          <w:rFonts w:ascii="Times New Roman" w:hAnsi="Times New Roman" w:cs="Times New Roman"/>
+          <w:sz w:val="24"/>
+          <w:szCs w:val="24"/>
+        </w:rPr>
+        <w:t>The system shall allow users to register an account.</w:t>
+      </w:r>
+    </w:p>
+    <w:p>
+      <w:pPr>
+        <w:pStyle w:val="ListParagraph"/>
+        <w:spacing w:after="0" w:line="360" w:lineRule="auto"/>
+        <w:ind w:left="420"/>
+        <w:jc w:val="both"/>
+        <w:rPr>
+          <w:rFonts w:ascii="Times New Roman" w:hAnsi="Times New Roman" w:cs="Times New Roman"/>
+          <w:b/>
+          <w:bCs/>
+          <w:sz w:val="24"/>
+          <w:szCs w:val="24"/>
+        </w:rPr>
+      </w:pPr>
+      <w:r>
+        <w:rPr>
+          <w:rFonts w:ascii="Times New Roman" w:hAnsi="Times New Roman" w:cs="Times New Roman"/>
+          <w:b/>
+          <w:bCs/>
+          <w:sz w:val="24"/>
+          <w:szCs w:val="24"/>
+        </w:rPr>
+        <w:t>B. Registered User Requirements</w:t>
+      </w:r>
+    </w:p>
+    <w:p>
+      <w:pPr>
+        <w:pStyle w:val="ListParagraph"/>
+        <w:numPr>
+          <w:ilvl w:val="0"/>
+          <w:numId w:val="42"/>
+        </w:numPr>
+        <w:spacing w:after="0" w:line="360" w:lineRule="auto"/>
+        <w:jc w:val="both"/>
+        <w:rPr>
+          <w:rFonts w:ascii="Times New Roman" w:hAnsi="Times New Roman" w:cs="Times New Roman"/>
+          <w:sz w:val="24"/>
+          <w:szCs w:val="24"/>
+        </w:rPr>
+      </w:pPr>
+      <w:r>
+        <w:rPr>
+          <w:rFonts w:ascii="Times New Roman" w:hAnsi="Times New Roman" w:cs="Times New Roman"/>
+          <w:sz w:val="24"/>
+          <w:szCs w:val="24"/>
+        </w:rPr>
+        <w:t>The system shall allow secure user login and logout.</w:t>
+      </w:r>
+    </w:p>
+    <w:p>
+      <w:pPr>
+        <w:pStyle w:val="ListParagraph"/>
+        <w:numPr>
+          <w:ilvl w:val="0"/>
+          <w:numId w:val="42"/>
+        </w:numPr>
+        <w:spacing w:after="0" w:line="360" w:lineRule="auto"/>
+        <w:jc w:val="both"/>
+        <w:rPr>
+          <w:rFonts w:ascii="Times New Roman" w:hAnsi="Times New Roman" w:cs="Times New Roman"/>
+          <w:sz w:val="24"/>
+          <w:szCs w:val="24"/>
+        </w:rPr>
+      </w:pPr>
+      <w:r>
+        <w:rPr>
+          <w:rFonts w:ascii="Times New Roman" w:hAnsi="Times New Roman" w:cs="Times New Roman"/>
+          <w:sz w:val="24"/>
+          <w:szCs w:val="24"/>
+        </w:rPr>
+        <w:t>The system shall display a dashboard with repositories and recent activity.</w:t>
+      </w:r>
+    </w:p>
+    <w:p>
+      <w:pPr>
+        <w:pStyle w:val="ListParagraph"/>
+        <w:numPr>
+          <w:ilvl w:val="0"/>
+          <w:numId w:val="42"/>
+        </w:numPr>
+        <w:spacing w:after="0" w:line="360" w:lineRule="auto"/>
+        <w:jc w:val="both"/>
+        <w:rPr>
+          <w:rFonts w:ascii="Times New Roman" w:hAnsi="Times New Roman" w:cs="Times New Roman"/>
+          <w:sz w:val="24"/>
+          <w:szCs w:val="24"/>
+        </w:rPr>
+      </w:pPr>
+      <w:r>
+        <w:rPr>
+          <w:rFonts w:ascii="Times New Roman" w:hAnsi="Times New Roman" w:cs="Times New Roman"/>
+          <w:sz w:val="24"/>
+          <w:szCs w:val="24"/>
+        </w:rPr>
+        <w:t>The system shall allow users to create repositories, commits, and issues.</w:t>
+      </w:r>
+    </w:p>
+    <w:p>
+      <w:pPr>
+        <w:pStyle w:val="ListParagraph"/>
+        <w:numPr>
+          <w:ilvl w:val="0"/>
+          <w:numId w:val="42"/>
+        </w:numPr>
+        <w:spacing w:after="0" w:line="360" w:lineRule="auto"/>
+        <w:jc w:val="both"/>
+        <w:rPr>
+          <w:rFonts w:ascii="Times New Roman" w:hAnsi="Times New Roman" w:cs="Times New Roman"/>
+          <w:sz w:val="24"/>
+          <w:szCs w:val="24"/>
+        </w:rPr>
+      </w:pPr>
+      <w:r>
+        <w:rPr>
+          <w:rFonts w:ascii="Times New Roman" w:hAnsi="Times New Roman" w:cs="Times New Roman"/>
+          <w:sz w:val="24"/>
+          <w:szCs w:val="24"/>
+        </w:rPr>
+        <w:t>The system shall allow users to view repositories and activity history.</w:t>
+      </w:r>
+    </w:p>
+    <w:p>
+      <w:pPr>
+        <w:pStyle w:val="ListParagraph"/>
+        <w:numPr>
+          <w:ilvl w:val="0"/>
+          <w:numId w:val="42"/>
+        </w:numPr>
+        <w:spacing w:after="0" w:line="360" w:lineRule="auto"/>
+        <w:jc w:val="both"/>
+        <w:rPr>
+          <w:rFonts w:ascii="Times New Roman" w:hAnsi="Times New Roman" w:cs="Times New Roman"/>
+          <w:sz w:val="24"/>
+          <w:szCs w:val="24"/>
+        </w:rPr>
+      </w:pPr>
+      <w:r>
+        <w:rPr>
+          <w:rFonts w:ascii="Times New Roman" w:hAnsi="Times New Roman" w:cs="Times New Roman"/>
+          <w:sz w:val="24"/>
+          <w:szCs w:val="24"/>
+        </w:rPr>
+        <w:t>The system shall allow users to manage their profile.</w:t>
+      </w:r>
+    </w:p>
+    <w:p>
+      <w:pPr>
+        <w:pStyle w:val="ListParagraph"/>
+        <w:spacing w:line="360" w:lineRule="auto"/>
+        <w:ind w:left="420"/>
+        <w:jc w:val="both"/>
+        <w:rPr>
+          <w:rFonts w:ascii="Times New Roman" w:hAnsi="Times New Roman" w:cs="Times New Roman"/>
+          <w:b/>
+          <w:bCs/>
+          <w:sz w:val="24"/>
+          <w:szCs w:val="24"/>
+        </w:rPr>
+      </w:pPr>
+    </w:p>
+    <w:p>
+      <w:pPr>
+        <w:pStyle w:val="ListParagraph"/>
+        <w:spacing w:after="0" w:line="360" w:lineRule="auto"/>
+        <w:ind w:left="420"/>
+        <w:jc w:val="both"/>
+        <w:rPr>
+          <w:rFonts w:ascii="Times New Roman" w:hAnsi="Times New Roman" w:cs="Times New Roman"/>
+          <w:b/>
+          <w:bCs/>
+          <w:sz w:val="24"/>
+          <w:szCs w:val="24"/>
+        </w:rPr>
+      </w:pPr>
+      <w:r>
+        <w:rPr>
+          <w:rFonts w:ascii="Times New Roman" w:hAnsi="Times New Roman" w:cs="Times New Roman"/>
+          <w:b/>
+          <w:bCs/>
+          <w:sz w:val="24"/>
+          <w:szCs w:val="24"/>
+        </w:rPr>
+        <w:t>2.2.4 Non-Functional Requirements</w:t>
+      </w:r>
+    </w:p>
+    <w:p>
+      <w:pPr>
+        <w:pStyle w:val="ListParagraph"/>
+        <w:numPr>
+          <w:ilvl w:val="0"/>
+          <w:numId w:val="43"/>
+        </w:numPr>
+        <w:spacing w:after="0" w:line="360" w:lineRule="auto"/>
+        <w:jc w:val="both"/>
+        <w:rPr>
+          <w:rFonts w:ascii="Times New Roman" w:hAnsi="Times New Roman" w:cs="Times New Roman"/>
+          <w:sz w:val="24"/>
+          <w:szCs w:val="24"/>
+        </w:rPr>
+      </w:pPr>
+      <w:r>
+        <w:rPr>
+          <w:rFonts w:ascii="Times New Roman" w:hAnsi="Times New Roman" w:cs="Times New Roman"/>
+          <w:sz w:val="24"/>
+          <w:szCs w:val="24"/>
+        </w:rPr>
+        <w:t>The system shall provide fast response time.</w:t>
+      </w:r>
+    </w:p>
+    <w:p>
+      <w:pPr>
+        <w:pStyle w:val="ListParagraph"/>
+        <w:numPr>
+          <w:ilvl w:val="0"/>
+          <w:numId w:val="43"/>
+        </w:numPr>
+        <w:spacing w:after="0" w:line="360" w:lineRule="auto"/>
+        <w:jc w:val="both"/>
+        <w:rPr>
+          <w:rFonts w:ascii="Times New Roman" w:hAnsi="Times New Roman" w:cs="Times New Roman"/>
+          <w:sz w:val="24"/>
+          <w:szCs w:val="24"/>
+        </w:rPr>
+      </w:pPr>
+      <w:r>
+        <w:rPr>
+          <w:rFonts w:ascii="Times New Roman" w:hAnsi="Times New Roman" w:cs="Times New Roman"/>
+          <w:sz w:val="24"/>
+          <w:szCs w:val="24"/>
+        </w:rPr>
+        <w:t>User data shall be securely stored and encrypted.</w:t>
+      </w:r>
+    </w:p>
+    <w:p>
+      <w:pPr>
+        <w:pStyle w:val="ListParagraph"/>
+        <w:numPr>
+          <w:ilvl w:val="0"/>
+          <w:numId w:val="43"/>
+        </w:numPr>
+        <w:spacing w:after="0" w:line="360" w:lineRule="auto"/>
+        <w:jc w:val="both"/>
+        <w:rPr>
+          <w:rFonts w:ascii="Times New Roman" w:hAnsi="Times New Roman" w:cs="Times New Roman"/>
+          <w:sz w:val="24"/>
+          <w:szCs w:val="24"/>
+        </w:rPr>
+      </w:pPr>
+      <w:r>
+        <w:rPr>
+          <w:rFonts w:ascii="Times New Roman" w:hAnsi="Times New Roman" w:cs="Times New Roman"/>
+          <w:sz w:val="24"/>
+          <w:szCs w:val="24"/>
+        </w:rPr>
+        <w:t>The system shall be easy to use and reliable.</w:t>
+      </w:r>
+    </w:p>
+    <w:p>
+      <w:pPr>
+        <w:pStyle w:val="ListParagraph"/>
+        <w:spacing w:after="0" w:line="360" w:lineRule="auto"/>
+        <w:jc w:val="both"/>
+        <w:rPr>
+          <w:rFonts w:ascii="Times New Roman" w:hAnsi="Times New Roman" w:cs="Times New Roman"/>
+          <w:sz w:val="24"/>
+          <w:szCs w:val="24"/>
+        </w:rPr>
+      </w:pPr>
+    </w:p>
+    <w:p>
+      <w:pPr>
+        <w:pStyle w:val="ListParagraph"/>
+        <w:spacing w:after="0" w:line="360" w:lineRule="auto"/>
+        <w:ind w:left="420"/>
+        <w:jc w:val="both"/>
+        <w:rPr>
+          <w:rFonts w:ascii="Times New Roman" w:hAnsi="Times New Roman" w:cs="Times New Roman"/>
+          <w:b/>
+          <w:bCs/>
+          <w:sz w:val="24"/>
+          <w:szCs w:val="24"/>
+        </w:rPr>
+      </w:pPr>
+      <w:r>
+        <w:rPr>
+          <w:rFonts w:ascii="Times New Roman" w:hAnsi="Times New Roman" w:cs="Times New Roman"/>
+          <w:b/>
+          <w:bCs/>
+          <w:sz w:val="24"/>
+          <w:szCs w:val="24"/>
+        </w:rPr>
+        <w:t>2.2.</w:t>
+      </w:r>
+      <w:r>
+        <w:rPr>
+          <w:rFonts w:ascii="Times New Roman" w:hAnsi="Times New Roman" w:cs="Times New Roman"/>
+          <w:b/>
+          <w:bCs/>
+          <w:sz w:val="24"/>
+          <w:szCs w:val="24"/>
+        </w:rPr>
+        <w:t>5</w:t>
+      </w:r>
+      <w:r>
+        <w:rPr>
+          <w:rFonts w:ascii="Times New Roman" w:hAnsi="Times New Roman" w:cs="Times New Roman"/>
+          <w:b/>
+          <w:bCs/>
+          <w:sz w:val="24"/>
+          <w:szCs w:val="24"/>
+        </w:rPr>
+        <w:t xml:space="preserve"> Assumptions</w:t>
+      </w:r>
+    </w:p>
+    <w:p>
+      <w:pPr>
+        <w:pStyle w:val="ListParagraph"/>
+        <w:numPr>
+          <w:ilvl w:val="0"/>
+          <w:numId w:val="44"/>
+        </w:numPr>
+        <w:spacing w:after="0" w:line="360" w:lineRule="auto"/>
+        <w:jc w:val="both"/>
+        <w:rPr>
+          <w:rFonts w:ascii="Times New Roman" w:hAnsi="Times New Roman" w:cs="Times New Roman"/>
+          <w:sz w:val="24"/>
+          <w:szCs w:val="24"/>
+        </w:rPr>
+      </w:pPr>
+      <w:r>
+        <w:rPr>
+          <w:rFonts w:ascii="Times New Roman" w:hAnsi="Times New Roman" w:cs="Times New Roman"/>
+          <w:sz w:val="24"/>
+          <w:szCs w:val="24"/>
+        </w:rPr>
+        <w:t>Users have basic internet knowledge.</w:t>
+      </w:r>
+    </w:p>
+    <w:p>
+      <w:pPr>
+        <w:pStyle w:val="ListParagraph"/>
+        <w:numPr>
+          <w:ilvl w:val="0"/>
+          <w:numId w:val="44"/>
+        </w:numPr>
+        <w:spacing w:after="0" w:line="360" w:lineRule="auto"/>
+        <w:jc w:val="both"/>
+        <w:rPr>
+          <w:rFonts w:ascii="Times New Roman" w:hAnsi="Times New Roman" w:cs="Times New Roman"/>
+          <w:sz w:val="24"/>
+          <w:szCs w:val="24"/>
+        </w:rPr>
+      </w:pPr>
+      <w:r>
+        <w:rPr>
+          <w:rFonts w:ascii="Times New Roman" w:hAnsi="Times New Roman" w:cs="Times New Roman"/>
+          <w:sz w:val="24"/>
+          <w:szCs w:val="24"/>
+        </w:rPr>
+        <w:t>Database availability is required.</w:t>
       </w:r>
     </w:p>
     <w:sectPr>
@@ -2128,17 +3820,7 @@
             <w:color w:val="000000" w:themeColor="text1"/>
             <w:sz w:val="24"/>
           </w:rPr>
-          <w:t xml:space="preserve">Web Application for </w:t>
-        </w:r>
-        <w:r>
-          <w:rPr>
-            <w:rFonts w:ascii="Times New Roman" w:hAnsi="Times New Roman" w:cs="Times New Roman"/>
-            <w:b/>
-            <w:bCs/>
-            <w:color w:val="000000" w:themeColor="text1"/>
-            <w:sz w:val="24"/>
-          </w:rPr>
-          <w:t xml:space="preserve">Repository Management System </w:t>
+          <w:t>Web Application for Repository Management System</w:t>
         </w:r>
       </w:sdtContent>
     </w:sdt>
@@ -2298,6 +3980,155 @@
     </w:lvl>
   </w:abstractNum>
   <w:abstractNum w:abstractNumId="1" w15:restartNumberingAfterBreak="0">
+    <w:nsid w:val="084C0D12"/>
+    <w:multiLevelType w:val="multilevel"/>
+    <w:tmpl w:val="3FD4F22C"/>
+    <w:lvl w:ilvl="0">
+      <w:start w:val="1"/>
+      <w:numFmt w:val="bullet"/>
+      <w:lvlText w:val=""/>
+      <w:lvlJc w:val="left"/>
+      <w:pPr>
+        <w:tabs>
+          <w:tab w:val="num" w:pos="720"/>
+        </w:tabs>
+        <w:ind w:left="720" w:hanging="360"/>
+      </w:pPr>
+      <w:rPr>
+        <w:rFonts w:ascii="Symbol" w:hAnsi="Symbol" w:hint="default"/>
+        <w:sz w:val="20"/>
+      </w:rPr>
+    </w:lvl>
+    <w:lvl w:ilvl="1" w:tentative="1">
+      <w:start w:val="1"/>
+      <w:numFmt w:val="bullet"/>
+      <w:lvlText w:val="o"/>
+      <w:lvlJc w:val="left"/>
+      <w:pPr>
+        <w:tabs>
+          <w:tab w:val="num" w:pos="1440"/>
+        </w:tabs>
+        <w:ind w:left="1440" w:hanging="360"/>
+      </w:pPr>
+      <w:rPr>
+        <w:rFonts w:ascii="Courier New" w:hAnsi="Courier New" w:hint="default"/>
+        <w:sz w:val="20"/>
+      </w:rPr>
+    </w:lvl>
+    <w:lvl w:ilvl="2" w:tentative="1">
+      <w:start w:val="1"/>
+      <w:numFmt w:val="bullet"/>
+      <w:lvlText w:val=""/>
+      <w:lvlJc w:val="left"/>
+      <w:pPr>
+        <w:tabs>
+          <w:tab w:val="num" w:pos="2160"/>
+        </w:tabs>
+        <w:ind w:left="2160" w:hanging="360"/>
+      </w:pPr>
+      <w:rPr>
+        <w:rFonts w:ascii="Wingdings" w:hAnsi="Wingdings" w:hint="default"/>
+        <w:sz w:val="20"/>
+      </w:rPr>
+    </w:lvl>
+    <w:lvl w:ilvl="3" w:tentative="1">
+      <w:start w:val="1"/>
+      <w:numFmt w:val="bullet"/>
+      <w:lvlText w:val=""/>
+      <w:lvlJc w:val="left"/>
+      <w:pPr>
+        <w:tabs>
+          <w:tab w:val="num" w:pos="2880"/>
+        </w:tabs>
+        <w:ind w:left="2880" w:hanging="360"/>
+      </w:pPr>
+      <w:rPr>
+        <w:rFonts w:ascii="Wingdings" w:hAnsi="Wingdings" w:hint="default"/>
+        <w:sz w:val="20"/>
+      </w:rPr>
+    </w:lvl>
+    <w:lvl w:ilvl="4" w:tentative="1">
+      <w:start w:val="1"/>
+      <w:numFmt w:val="bullet"/>
+      <w:lvlText w:val=""/>
+      <w:lvlJc w:val="left"/>
+      <w:pPr>
+        <w:tabs>
+          <w:tab w:val="num" w:pos="3600"/>
+        </w:tabs>
+        <w:ind w:left="3600" w:hanging="360"/>
+      </w:pPr>
+      <w:rPr>
+        <w:rFonts w:ascii="Wingdings" w:hAnsi="Wingdings" w:hint="default"/>
+        <w:sz w:val="20"/>
+      </w:rPr>
+    </w:lvl>
+    <w:lvl w:ilvl="5" w:tentative="1">
+      <w:start w:val="1"/>
+      <w:numFmt w:val="bullet"/>
+      <w:lvlText w:val=""/>
+      <w:lvlJc w:val="left"/>
+      <w:pPr>
+        <w:tabs>
+          <w:tab w:val="num" w:pos="4320"/>
+        </w:tabs>
+        <w:ind w:left="4320" w:hanging="360"/>
+      </w:pPr>
+      <w:rPr>
+        <w:rFonts w:ascii="Wingdings" w:hAnsi="Wingdings" w:hint="default"/>
+        <w:sz w:val="20"/>
+      </w:rPr>
+    </w:lvl>
+    <w:lvl w:ilvl="6" w:tentative="1">
+      <w:start w:val="1"/>
+      <w:numFmt w:val="bullet"/>
+      <w:lvlText w:val=""/>
+      <w:lvlJc w:val="left"/>
+      <w:pPr>
+        <w:tabs>
+          <w:tab w:val="num" w:pos="5040"/>
+        </w:tabs>
+        <w:ind w:left="5040" w:hanging="360"/>
+      </w:pPr>
+      <w:rPr>
+        <w:rFonts w:ascii="Wingdings" w:hAnsi="Wingdings" w:hint="default"/>
+        <w:sz w:val="20"/>
+      </w:rPr>
+    </w:lvl>
+    <w:lvl w:ilvl="7" w:tentative="1">
+      <w:start w:val="1"/>
+      <w:numFmt w:val="bullet"/>
+      <w:lvlText w:val=""/>
+      <w:lvlJc w:val="left"/>
+      <w:pPr>
+        <w:tabs>
+          <w:tab w:val="num" w:pos="5760"/>
+        </w:tabs>
+        <w:ind w:left="5760" w:hanging="360"/>
+      </w:pPr>
+      <w:rPr>
+        <w:rFonts w:ascii="Wingdings" w:hAnsi="Wingdings" w:hint="default"/>
+        <w:sz w:val="20"/>
+      </w:rPr>
+    </w:lvl>
+    <w:lvl w:ilvl="8" w:tentative="1">
+      <w:start w:val="1"/>
+      <w:numFmt w:val="bullet"/>
+      <w:lvlText w:val=""/>
+      <w:lvlJc w:val="left"/>
+      <w:pPr>
+        <w:tabs>
+          <w:tab w:val="num" w:pos="6480"/>
+        </w:tabs>
+        <w:ind w:left="6480" w:hanging="360"/>
+      </w:pPr>
+      <w:rPr>
+        <w:rFonts w:ascii="Wingdings" w:hAnsi="Wingdings" w:hint="default"/>
+        <w:sz w:val="20"/>
+      </w:rPr>
+    </w:lvl>
+  </w:abstractNum>
+  <w:abstractNum w:abstractNumId="2" w15:restartNumberingAfterBreak="0">
     <w:nsid w:val="0D9A0E53"/>
     <w:multiLevelType w:val="multilevel"/>
     <w:tmpl w:val="8E36524E"/>
@@ -2446,7 +4277,7 @@
       </w:rPr>
     </w:lvl>
   </w:abstractNum>
-  <w:abstractNum w:abstractNumId="2" w15:restartNumberingAfterBreak="0">
+  <w:abstractNum w:abstractNumId="3" w15:restartNumberingAfterBreak="0">
     <w:nsid w:val="0DB50961"/>
     <w:multiLevelType w:val="hybridMultilevel"/>
     <w:tmpl w:val="3E0A7404"/>
@@ -2536,7 +4367,7 @@
       </w:pPr>
     </w:lvl>
   </w:abstractNum>
-  <w:abstractNum w:abstractNumId="3" w15:restartNumberingAfterBreak="0">
+  <w:abstractNum w:abstractNumId="4" w15:restartNumberingAfterBreak="0">
     <w:nsid w:val="104674FE"/>
     <w:multiLevelType w:val="hybridMultilevel"/>
     <w:tmpl w:val="9D5C6472"/>
@@ -2625,7 +4456,273 @@
       </w:pPr>
     </w:lvl>
   </w:abstractNum>
-  <w:abstractNum w:abstractNumId="4" w15:restartNumberingAfterBreak="0">
+  <w:abstractNum w:abstractNumId="5" w15:restartNumberingAfterBreak="0">
+    <w:nsid w:val="10793819"/>
+    <w:multiLevelType w:val="multilevel"/>
+    <w:tmpl w:val="C7A80818"/>
+    <w:lvl w:ilvl="0">
+      <w:start w:val="1"/>
+      <w:numFmt w:val="decimal"/>
+      <w:lvlText w:val="%1."/>
+      <w:lvlJc w:val="left"/>
+      <w:pPr>
+        <w:tabs>
+          <w:tab w:val="num" w:pos="720"/>
+        </w:tabs>
+        <w:ind w:left="720" w:hanging="360"/>
+      </w:pPr>
+    </w:lvl>
+    <w:lvl w:ilvl="1">
+      <w:start w:val="1"/>
+      <w:numFmt w:val="bullet"/>
+      <w:lvlText w:val="o"/>
+      <w:lvlJc w:val="left"/>
+      <w:pPr>
+        <w:tabs>
+          <w:tab w:val="num" w:pos="1440"/>
+        </w:tabs>
+        <w:ind w:left="1440" w:hanging="360"/>
+      </w:pPr>
+      <w:rPr>
+        <w:rFonts w:ascii="Courier New" w:hAnsi="Courier New" w:hint="default"/>
+        <w:sz w:val="20"/>
+      </w:rPr>
+    </w:lvl>
+    <w:lvl w:ilvl="2" w:tentative="1">
+      <w:start w:val="1"/>
+      <w:numFmt w:val="decimal"/>
+      <w:lvlText w:val="%3."/>
+      <w:lvlJc w:val="left"/>
+      <w:pPr>
+        <w:tabs>
+          <w:tab w:val="num" w:pos="2160"/>
+        </w:tabs>
+        <w:ind w:left="2160" w:hanging="360"/>
+      </w:pPr>
+    </w:lvl>
+    <w:lvl w:ilvl="3" w:tentative="1">
+      <w:start w:val="1"/>
+      <w:numFmt w:val="decimal"/>
+      <w:lvlText w:val="%4."/>
+      <w:lvlJc w:val="left"/>
+      <w:pPr>
+        <w:tabs>
+          <w:tab w:val="num" w:pos="2880"/>
+        </w:tabs>
+        <w:ind w:left="2880" w:hanging="360"/>
+      </w:pPr>
+    </w:lvl>
+    <w:lvl w:ilvl="4" w:tentative="1">
+      <w:start w:val="1"/>
+      <w:numFmt w:val="decimal"/>
+      <w:lvlText w:val="%5."/>
+      <w:lvlJc w:val="left"/>
+      <w:pPr>
+        <w:tabs>
+          <w:tab w:val="num" w:pos="3600"/>
+        </w:tabs>
+        <w:ind w:left="3600" w:hanging="360"/>
+      </w:pPr>
+    </w:lvl>
+    <w:lvl w:ilvl="5" w:tentative="1">
+      <w:start w:val="1"/>
+      <w:numFmt w:val="decimal"/>
+      <w:lvlText w:val="%6."/>
+      <w:lvlJc w:val="left"/>
+      <w:pPr>
+        <w:tabs>
+          <w:tab w:val="num" w:pos="4320"/>
+        </w:tabs>
+        <w:ind w:left="4320" w:hanging="360"/>
+      </w:pPr>
+    </w:lvl>
+    <w:lvl w:ilvl="6" w:tentative="1">
+      <w:start w:val="1"/>
+      <w:numFmt w:val="decimal"/>
+      <w:lvlText w:val="%7."/>
+      <w:lvlJc w:val="left"/>
+      <w:pPr>
+        <w:tabs>
+          <w:tab w:val="num" w:pos="5040"/>
+        </w:tabs>
+        <w:ind w:left="5040" w:hanging="360"/>
+      </w:pPr>
+    </w:lvl>
+    <w:lvl w:ilvl="7" w:tentative="1">
+      <w:start w:val="1"/>
+      <w:numFmt w:val="decimal"/>
+      <w:lvlText w:val="%8."/>
+      <w:lvlJc w:val="left"/>
+      <w:pPr>
+        <w:tabs>
+          <w:tab w:val="num" w:pos="5760"/>
+        </w:tabs>
+        <w:ind w:left="5760" w:hanging="360"/>
+      </w:pPr>
+    </w:lvl>
+    <w:lvl w:ilvl="8" w:tentative="1">
+      <w:start w:val="1"/>
+      <w:numFmt w:val="decimal"/>
+      <w:lvlText w:val="%9."/>
+      <w:lvlJc w:val="left"/>
+      <w:pPr>
+        <w:tabs>
+          <w:tab w:val="num" w:pos="6480"/>
+        </w:tabs>
+        <w:ind w:left="6480" w:hanging="360"/>
+      </w:pPr>
+    </w:lvl>
+  </w:abstractNum>
+  <w:abstractNum w:abstractNumId="6" w15:restartNumberingAfterBreak="0">
+    <w:nsid w:val="109F43D3"/>
+    <w:multiLevelType w:val="multilevel"/>
+    <w:tmpl w:val="69ECFE38"/>
+    <w:lvl w:ilvl="0">
+      <w:start w:val="1"/>
+      <w:numFmt w:val="bullet"/>
+      <w:lvlText w:val=""/>
+      <w:lvlJc w:val="left"/>
+      <w:pPr>
+        <w:tabs>
+          <w:tab w:val="num" w:pos="720"/>
+        </w:tabs>
+        <w:ind w:left="720" w:hanging="360"/>
+      </w:pPr>
+      <w:rPr>
+        <w:rFonts w:ascii="Symbol" w:hAnsi="Symbol" w:hint="default"/>
+        <w:sz w:val="20"/>
+      </w:rPr>
+    </w:lvl>
+    <w:lvl w:ilvl="1" w:tentative="1">
+      <w:start w:val="1"/>
+      <w:numFmt w:val="bullet"/>
+      <w:lvlText w:val="o"/>
+      <w:lvlJc w:val="left"/>
+      <w:pPr>
+        <w:tabs>
+          <w:tab w:val="num" w:pos="1440"/>
+        </w:tabs>
+        <w:ind w:left="1440" w:hanging="360"/>
+      </w:pPr>
+      <w:rPr>
+        <w:rFonts w:ascii="Courier New" w:hAnsi="Courier New" w:hint="default"/>
+        <w:sz w:val="20"/>
+      </w:rPr>
+    </w:lvl>
+    <w:lvl w:ilvl="2" w:tentative="1">
+      <w:start w:val="1"/>
+      <w:numFmt w:val="bullet"/>
+      <w:lvlText w:val=""/>
+      <w:lvlJc w:val="left"/>
+      <w:pPr>
+        <w:tabs>
+          <w:tab w:val="num" w:pos="2160"/>
+        </w:tabs>
+        <w:ind w:left="2160" w:hanging="360"/>
+      </w:pPr>
+      <w:rPr>
+        <w:rFonts w:ascii="Wingdings" w:hAnsi="Wingdings" w:hint="default"/>
+        <w:sz w:val="20"/>
+      </w:rPr>
+    </w:lvl>
+    <w:lvl w:ilvl="3" w:tentative="1">
+      <w:start w:val="1"/>
+      <w:numFmt w:val="bullet"/>
+      <w:lvlText w:val=""/>
+      <w:lvlJc w:val="left"/>
+      <w:pPr>
+        <w:tabs>
+          <w:tab w:val="num" w:pos="2880"/>
+        </w:tabs>
+        <w:ind w:left="2880" w:hanging="360"/>
+      </w:pPr>
+      <w:rPr>
+        <w:rFonts w:ascii="Wingdings" w:hAnsi="Wingdings" w:hint="default"/>
+        <w:sz w:val="20"/>
+      </w:rPr>
+    </w:lvl>
+    <w:lvl w:ilvl="4" w:tentative="1">
+      <w:start w:val="1"/>
+      <w:numFmt w:val="bullet"/>
+      <w:lvlText w:val=""/>
+      <w:lvlJc w:val="left"/>
+      <w:pPr>
+        <w:tabs>
+          <w:tab w:val="num" w:pos="3600"/>
+        </w:tabs>
+        <w:ind w:left="3600" w:hanging="360"/>
+      </w:pPr>
+      <w:rPr>
+        <w:rFonts w:ascii="Wingdings" w:hAnsi="Wingdings" w:hint="default"/>
+        <w:sz w:val="20"/>
+      </w:rPr>
+    </w:lvl>
+    <w:lvl w:ilvl="5" w:tentative="1">
+      <w:start w:val="1"/>
+      <w:numFmt w:val="bullet"/>
+      <w:lvlText w:val=""/>
+      <w:lvlJc w:val="left"/>
+      <w:pPr>
+        <w:tabs>
+          <w:tab w:val="num" w:pos="4320"/>
+        </w:tabs>
+        <w:ind w:left="4320" w:hanging="360"/>
+      </w:pPr>
+      <w:rPr>
+        <w:rFonts w:ascii="Wingdings" w:hAnsi="Wingdings" w:hint="default"/>
+        <w:sz w:val="20"/>
+      </w:rPr>
+    </w:lvl>
+    <w:lvl w:ilvl="6" w:tentative="1">
+      <w:start w:val="1"/>
+      <w:numFmt w:val="bullet"/>
+      <w:lvlText w:val=""/>
+      <w:lvlJc w:val="left"/>
+      <w:pPr>
+        <w:tabs>
+          <w:tab w:val="num" w:pos="5040"/>
+        </w:tabs>
+        <w:ind w:left="5040" w:hanging="360"/>
+      </w:pPr>
+      <w:rPr>
+        <w:rFonts w:ascii="Wingdings" w:hAnsi="Wingdings" w:hint="default"/>
+        <w:sz w:val="20"/>
+      </w:rPr>
+    </w:lvl>
+    <w:lvl w:ilvl="7" w:tentative="1">
+      <w:start w:val="1"/>
+      <w:numFmt w:val="bullet"/>
+      <w:lvlText w:val=""/>
+      <w:lvlJc w:val="left"/>
+      <w:pPr>
+        <w:tabs>
+          <w:tab w:val="num" w:pos="5760"/>
+        </w:tabs>
+        <w:ind w:left="5760" w:hanging="360"/>
+      </w:pPr>
+      <w:rPr>
+        <w:rFonts w:ascii="Wingdings" w:hAnsi="Wingdings" w:hint="default"/>
+        <w:sz w:val="20"/>
+      </w:rPr>
+    </w:lvl>
+    <w:lvl w:ilvl="8" w:tentative="1">
+      <w:start w:val="1"/>
+      <w:numFmt w:val="bullet"/>
+      <w:lvlText w:val=""/>
+      <w:lvlJc w:val="left"/>
+      <w:pPr>
+        <w:tabs>
+          <w:tab w:val="num" w:pos="6480"/>
+        </w:tabs>
+        <w:ind w:left="6480" w:hanging="360"/>
+      </w:pPr>
+      <w:rPr>
+        <w:rFonts w:ascii="Wingdings" w:hAnsi="Wingdings" w:hint="default"/>
+        <w:sz w:val="20"/>
+      </w:rPr>
+    </w:lvl>
+  </w:abstractNum>
+  <w:abstractNum w:abstractNumId="7" w15:restartNumberingAfterBreak="0">
     <w:nsid w:val="16B71517"/>
     <w:multiLevelType w:val="hybridMultilevel"/>
     <w:tmpl w:val="6D6AD878"/>
@@ -2738,7 +4835,7 @@
       </w:rPr>
     </w:lvl>
   </w:abstractNum>
-  <w:abstractNum w:abstractNumId="5" w15:restartNumberingAfterBreak="0">
+  <w:abstractNum w:abstractNumId="8" w15:restartNumberingAfterBreak="0">
     <w:nsid w:val="18801CC1"/>
     <w:multiLevelType w:val="hybridMultilevel"/>
     <w:tmpl w:val="8FC01B2E"/>
@@ -2828,7 +4925,240 @@
       </w:pPr>
     </w:lvl>
   </w:abstractNum>
-  <w:abstractNum w:abstractNumId="6" w15:restartNumberingAfterBreak="0">
+  <w:abstractNum w:abstractNumId="9" w15:restartNumberingAfterBreak="0">
+    <w:nsid w:val="1C4F2D9D"/>
+    <w:multiLevelType w:val="multilevel"/>
+    <w:tmpl w:val="93E2CD24"/>
+    <w:lvl w:ilvl="0">
+      <w:start w:val="1"/>
+      <w:numFmt w:val="bullet"/>
+      <w:lvlText w:val=""/>
+      <w:lvlJc w:val="left"/>
+      <w:pPr>
+        <w:tabs>
+          <w:tab w:val="num" w:pos="720"/>
+        </w:tabs>
+        <w:ind w:left="720" w:hanging="360"/>
+      </w:pPr>
+      <w:rPr>
+        <w:rFonts w:ascii="Symbol" w:hAnsi="Symbol" w:hint="default"/>
+      </w:rPr>
+    </w:lvl>
+    <w:lvl w:ilvl="1" w:tentative="1">
+      <w:start w:val="1"/>
+      <w:numFmt w:val="decimal"/>
+      <w:lvlText w:val="%2."/>
+      <w:lvlJc w:val="left"/>
+      <w:pPr>
+        <w:tabs>
+          <w:tab w:val="num" w:pos="1440"/>
+        </w:tabs>
+        <w:ind w:left="1440" w:hanging="360"/>
+      </w:pPr>
+    </w:lvl>
+    <w:lvl w:ilvl="2" w:tentative="1">
+      <w:start w:val="1"/>
+      <w:numFmt w:val="decimal"/>
+      <w:lvlText w:val="%3."/>
+      <w:lvlJc w:val="left"/>
+      <w:pPr>
+        <w:tabs>
+          <w:tab w:val="num" w:pos="2160"/>
+        </w:tabs>
+        <w:ind w:left="2160" w:hanging="360"/>
+      </w:pPr>
+    </w:lvl>
+    <w:lvl w:ilvl="3" w:tentative="1">
+      <w:start w:val="1"/>
+      <w:numFmt w:val="decimal"/>
+      <w:lvlText w:val="%4."/>
+      <w:lvlJc w:val="left"/>
+      <w:pPr>
+        <w:tabs>
+          <w:tab w:val="num" w:pos="2880"/>
+        </w:tabs>
+        <w:ind w:left="2880" w:hanging="360"/>
+      </w:pPr>
+    </w:lvl>
+    <w:lvl w:ilvl="4" w:tentative="1">
+      <w:start w:val="1"/>
+      <w:numFmt w:val="decimal"/>
+      <w:lvlText w:val="%5."/>
+      <w:lvlJc w:val="left"/>
+      <w:pPr>
+        <w:tabs>
+          <w:tab w:val="num" w:pos="3600"/>
+        </w:tabs>
+        <w:ind w:left="3600" w:hanging="360"/>
+      </w:pPr>
+    </w:lvl>
+    <w:lvl w:ilvl="5" w:tentative="1">
+      <w:start w:val="1"/>
+      <w:numFmt w:val="decimal"/>
+      <w:lvlText w:val="%6."/>
+      <w:lvlJc w:val="left"/>
+      <w:pPr>
+        <w:tabs>
+          <w:tab w:val="num" w:pos="4320"/>
+        </w:tabs>
+        <w:ind w:left="4320" w:hanging="360"/>
+      </w:pPr>
+    </w:lvl>
+    <w:lvl w:ilvl="6" w:tentative="1">
+      <w:start w:val="1"/>
+      <w:numFmt w:val="decimal"/>
+      <w:lvlText w:val="%7."/>
+      <w:lvlJc w:val="left"/>
+      <w:pPr>
+        <w:tabs>
+          <w:tab w:val="num" w:pos="5040"/>
+        </w:tabs>
+        <w:ind w:left="5040" w:hanging="360"/>
+      </w:pPr>
+    </w:lvl>
+    <w:lvl w:ilvl="7" w:tentative="1">
+      <w:start w:val="1"/>
+      <w:numFmt w:val="decimal"/>
+      <w:lvlText w:val="%8."/>
+      <w:lvlJc w:val="left"/>
+      <w:pPr>
+        <w:tabs>
+          <w:tab w:val="num" w:pos="5760"/>
+        </w:tabs>
+        <w:ind w:left="5760" w:hanging="360"/>
+      </w:pPr>
+    </w:lvl>
+    <w:lvl w:ilvl="8" w:tentative="1">
+      <w:start w:val="1"/>
+      <w:numFmt w:val="decimal"/>
+      <w:lvlText w:val="%9."/>
+      <w:lvlJc w:val="left"/>
+      <w:pPr>
+        <w:tabs>
+          <w:tab w:val="num" w:pos="6480"/>
+        </w:tabs>
+        <w:ind w:left="6480" w:hanging="360"/>
+      </w:pPr>
+    </w:lvl>
+  </w:abstractNum>
+  <w:abstractNum w:abstractNumId="10" w15:restartNumberingAfterBreak="0">
+    <w:nsid w:val="200B6F4E"/>
+    <w:multiLevelType w:val="multilevel"/>
+    <w:tmpl w:val="C98EE768"/>
+    <w:lvl w:ilvl="0">
+      <w:start w:val="1"/>
+      <w:numFmt w:val="decimal"/>
+      <w:lvlText w:val="%1."/>
+      <w:lvlJc w:val="left"/>
+      <w:pPr>
+        <w:tabs>
+          <w:tab w:val="num" w:pos="720"/>
+        </w:tabs>
+        <w:ind w:left="720" w:hanging="360"/>
+      </w:pPr>
+    </w:lvl>
+    <w:lvl w:ilvl="1">
+      <w:start w:val="1"/>
+      <w:numFmt w:val="bullet"/>
+      <w:lvlText w:val="o"/>
+      <w:lvlJc w:val="left"/>
+      <w:pPr>
+        <w:tabs>
+          <w:tab w:val="num" w:pos="1440"/>
+        </w:tabs>
+        <w:ind w:left="1440" w:hanging="360"/>
+      </w:pPr>
+      <w:rPr>
+        <w:rFonts w:ascii="Courier New" w:hAnsi="Courier New" w:hint="default"/>
+        <w:sz w:val="20"/>
+      </w:rPr>
+    </w:lvl>
+    <w:lvl w:ilvl="2" w:tentative="1">
+      <w:start w:val="1"/>
+      <w:numFmt w:val="decimal"/>
+      <w:lvlText w:val="%3."/>
+      <w:lvlJc w:val="left"/>
+      <w:pPr>
+        <w:tabs>
+          <w:tab w:val="num" w:pos="2160"/>
+        </w:tabs>
+        <w:ind w:left="2160" w:hanging="360"/>
+      </w:pPr>
+    </w:lvl>
+    <w:lvl w:ilvl="3" w:tentative="1">
+      <w:start w:val="1"/>
+      <w:numFmt w:val="decimal"/>
+      <w:lvlText w:val="%4."/>
+      <w:lvlJc w:val="left"/>
+      <w:pPr>
+        <w:tabs>
+          <w:tab w:val="num" w:pos="2880"/>
+        </w:tabs>
+        <w:ind w:left="2880" w:hanging="360"/>
+      </w:pPr>
+    </w:lvl>
+    <w:lvl w:ilvl="4" w:tentative="1">
+      <w:start w:val="1"/>
+      <w:numFmt w:val="decimal"/>
+      <w:lvlText w:val="%5."/>
+      <w:lvlJc w:val="left"/>
+      <w:pPr>
+        <w:tabs>
+          <w:tab w:val="num" w:pos="3600"/>
+        </w:tabs>
+        <w:ind w:left="3600" w:hanging="360"/>
+      </w:pPr>
+    </w:lvl>
+    <w:lvl w:ilvl="5" w:tentative="1">
+      <w:start w:val="1"/>
+      <w:numFmt w:val="decimal"/>
+      <w:lvlText w:val="%6."/>
+      <w:lvlJc w:val="left"/>
+      <w:pPr>
+        <w:tabs>
+          <w:tab w:val="num" w:pos="4320"/>
+        </w:tabs>
+        <w:ind w:left="4320" w:hanging="360"/>
+      </w:pPr>
+    </w:lvl>
+    <w:lvl w:ilvl="6" w:tentative="1">
+      <w:start w:val="1"/>
+      <w:numFmt w:val="decimal"/>
+      <w:lvlText w:val="%7."/>
+      <w:lvlJc w:val="left"/>
+      <w:pPr>
+        <w:tabs>
+          <w:tab w:val="num" w:pos="5040"/>
+        </w:tabs>
+        <w:ind w:left="5040" w:hanging="360"/>
+      </w:pPr>
+    </w:lvl>
+    <w:lvl w:ilvl="7" w:tentative="1">
+      <w:start w:val="1"/>
+      <w:numFmt w:val="decimal"/>
+      <w:lvlText w:val="%8."/>
+      <w:lvlJc w:val="left"/>
+      <w:pPr>
+        <w:tabs>
+          <w:tab w:val="num" w:pos="5760"/>
+        </w:tabs>
+        <w:ind w:left="5760" w:hanging="360"/>
+      </w:pPr>
+    </w:lvl>
+    <w:lvl w:ilvl="8" w:tentative="1">
+      <w:start w:val="1"/>
+      <w:numFmt w:val="decimal"/>
+      <w:lvlText w:val="%9."/>
+      <w:lvlJc w:val="left"/>
+      <w:pPr>
+        <w:tabs>
+          <w:tab w:val="num" w:pos="6480"/>
+        </w:tabs>
+        <w:ind w:left="6480" w:hanging="360"/>
+      </w:pPr>
+    </w:lvl>
+  </w:abstractNum>
+  <w:abstractNum w:abstractNumId="11" w15:restartNumberingAfterBreak="0">
     <w:nsid w:val="223760F5"/>
     <w:multiLevelType w:val="multilevel"/>
     <w:tmpl w:val="E1389C38"/>
@@ -2941,7 +5271,124 @@
       </w:rPr>
     </w:lvl>
   </w:abstractNum>
-  <w:abstractNum w:abstractNumId="7" w15:restartNumberingAfterBreak="0">
+  <w:abstractNum w:abstractNumId="12" w15:restartNumberingAfterBreak="0">
+    <w:nsid w:val="226E04AB"/>
+    <w:multiLevelType w:val="multilevel"/>
+    <w:tmpl w:val="98F0DEFA"/>
+    <w:lvl w:ilvl="0">
+      <w:start w:val="1"/>
+      <w:numFmt w:val="decimal"/>
+      <w:lvlText w:val="%1."/>
+      <w:lvlJc w:val="left"/>
+      <w:pPr>
+        <w:tabs>
+          <w:tab w:val="num" w:pos="720"/>
+        </w:tabs>
+        <w:ind w:left="720" w:hanging="360"/>
+      </w:pPr>
+    </w:lvl>
+    <w:lvl w:ilvl="1">
+      <w:start w:val="1"/>
+      <w:numFmt w:val="bullet"/>
+      <w:lvlText w:val="o"/>
+      <w:lvlJc w:val="left"/>
+      <w:pPr>
+        <w:tabs>
+          <w:tab w:val="num" w:pos="1440"/>
+        </w:tabs>
+        <w:ind w:left="1440" w:hanging="360"/>
+      </w:pPr>
+      <w:rPr>
+        <w:rFonts w:ascii="Courier New" w:hAnsi="Courier New" w:hint="default"/>
+        <w:sz w:val="20"/>
+      </w:rPr>
+    </w:lvl>
+    <w:lvl w:ilvl="2" w:tentative="1">
+      <w:start w:val="1"/>
+      <w:numFmt w:val="decimal"/>
+      <w:lvlText w:val="%3."/>
+      <w:lvlJc w:val="left"/>
+      <w:pPr>
+        <w:tabs>
+          <w:tab w:val="num" w:pos="2160"/>
+        </w:tabs>
+        <w:ind w:left="2160" w:hanging="360"/>
+      </w:pPr>
+    </w:lvl>
+    <w:lvl w:ilvl="3" w:tentative="1">
+      <w:start w:val="1"/>
+      <w:numFmt w:val="decimal"/>
+      <w:lvlText w:val="%4."/>
+      <w:lvlJc w:val="left"/>
+      <w:pPr>
+        <w:tabs>
+          <w:tab w:val="num" w:pos="2880"/>
+        </w:tabs>
+        <w:ind w:left="2880" w:hanging="360"/>
+      </w:pPr>
+    </w:lvl>
+    <w:lvl w:ilvl="4" w:tentative="1">
+      <w:start w:val="1"/>
+      <w:numFmt w:val="decimal"/>
+      <w:lvlText w:val="%5."/>
+      <w:lvlJc w:val="left"/>
+      <w:pPr>
+        <w:tabs>
+          <w:tab w:val="num" w:pos="3600"/>
+        </w:tabs>
+        <w:ind w:left="3600" w:hanging="360"/>
+      </w:pPr>
+    </w:lvl>
+    <w:lvl w:ilvl="5" w:tentative="1">
+      <w:start w:val="1"/>
+      <w:numFmt w:val="decimal"/>
+      <w:lvlText w:val="%6."/>
+      <w:lvlJc w:val="left"/>
+      <w:pPr>
+        <w:tabs>
+          <w:tab w:val="num" w:pos="4320"/>
+        </w:tabs>
+        <w:ind w:left="4320" w:hanging="360"/>
+      </w:pPr>
+    </w:lvl>
+    <w:lvl w:ilvl="6" w:tentative="1">
+      <w:start w:val="1"/>
+      <w:numFmt w:val="decimal"/>
+      <w:lvlText w:val="%7."/>
+      <w:lvlJc w:val="left"/>
+      <w:pPr>
+        <w:tabs>
+          <w:tab w:val="num" w:pos="5040"/>
+        </w:tabs>
+        <w:ind w:left="5040" w:hanging="360"/>
+      </w:pPr>
+    </w:lvl>
+    <w:lvl w:ilvl="7" w:tentative="1">
+      <w:start w:val="1"/>
+      <w:numFmt w:val="decimal"/>
+      <w:lvlText w:val="%8."/>
+      <w:lvlJc w:val="left"/>
+      <w:pPr>
+        <w:tabs>
+          <w:tab w:val="num" w:pos="5760"/>
+        </w:tabs>
+        <w:ind w:left="5760" w:hanging="360"/>
+      </w:pPr>
+    </w:lvl>
+    <w:lvl w:ilvl="8" w:tentative="1">
+      <w:start w:val="1"/>
+      <w:numFmt w:val="decimal"/>
+      <w:lvlText w:val="%9."/>
+      <w:lvlJc w:val="left"/>
+      <w:pPr>
+        <w:tabs>
+          <w:tab w:val="num" w:pos="6480"/>
+        </w:tabs>
+        <w:ind w:left="6480" w:hanging="360"/>
+      </w:pPr>
+    </w:lvl>
+  </w:abstractNum>
+  <w:abstractNum w:abstractNumId="13" w15:restartNumberingAfterBreak="0">
     <w:nsid w:val="23565ADE"/>
     <w:multiLevelType w:val="hybridMultilevel"/>
     <w:tmpl w:val="DB0CE7C6"/>
@@ -3054,7 +5501,7 @@
       </w:rPr>
     </w:lvl>
   </w:abstractNum>
-  <w:abstractNum w:abstractNumId="8" w15:restartNumberingAfterBreak="0">
+  <w:abstractNum w:abstractNumId="14" w15:restartNumberingAfterBreak="0">
     <w:nsid w:val="24840491"/>
     <w:multiLevelType w:val="hybridMultilevel"/>
     <w:tmpl w:val="D28247FC"/>
@@ -3167,7 +5614,7 @@
       </w:rPr>
     </w:lvl>
   </w:abstractNum>
-  <w:abstractNum w:abstractNumId="9" w15:restartNumberingAfterBreak="0">
+  <w:abstractNum w:abstractNumId="15" w15:restartNumberingAfterBreak="0">
     <w:nsid w:val="24D11317"/>
     <w:multiLevelType w:val="multilevel"/>
     <w:tmpl w:val="00E6F136"/>
@@ -3316,7 +5763,7 @@
       </w:rPr>
     </w:lvl>
   </w:abstractNum>
-  <w:abstractNum w:abstractNumId="10" w15:restartNumberingAfterBreak="0">
+  <w:abstractNum w:abstractNumId="16" w15:restartNumberingAfterBreak="0">
     <w:nsid w:val="27D30305"/>
     <w:multiLevelType w:val="multilevel"/>
     <w:tmpl w:val="1804C9AE"/>
@@ -3465,7 +5912,7 @@
       </w:rPr>
     </w:lvl>
   </w:abstractNum>
-  <w:abstractNum w:abstractNumId="11" w15:restartNumberingAfterBreak="0">
+  <w:abstractNum w:abstractNumId="17" w15:restartNumberingAfterBreak="0">
     <w:nsid w:val="29BE1C21"/>
     <w:multiLevelType w:val="hybridMultilevel"/>
     <w:tmpl w:val="B66E3906"/>
@@ -3554,7 +6001,7 @@
       </w:pPr>
     </w:lvl>
   </w:abstractNum>
-  <w:abstractNum w:abstractNumId="12" w15:restartNumberingAfterBreak="0">
+  <w:abstractNum w:abstractNumId="18" w15:restartNumberingAfterBreak="0">
     <w:nsid w:val="2EA35BFD"/>
     <w:multiLevelType w:val="hybridMultilevel"/>
     <w:tmpl w:val="A68A8BB0"/>
@@ -3667,7 +6114,7 @@
       </w:rPr>
     </w:lvl>
   </w:abstractNum>
-  <w:abstractNum w:abstractNumId="13" w15:restartNumberingAfterBreak="0">
+  <w:abstractNum w:abstractNumId="19" w15:restartNumberingAfterBreak="0">
     <w:nsid w:val="30350EBA"/>
     <w:multiLevelType w:val="hybridMultilevel"/>
     <w:tmpl w:val="FC6C6FF4"/>
@@ -3757,7 +6204,7 @@
       </w:pPr>
     </w:lvl>
   </w:abstractNum>
-  <w:abstractNum w:abstractNumId="14" w15:restartNumberingAfterBreak="0">
+  <w:abstractNum w:abstractNumId="20" w15:restartNumberingAfterBreak="0">
     <w:nsid w:val="31F241A9"/>
     <w:multiLevelType w:val="hybridMultilevel"/>
     <w:tmpl w:val="8196C032"/>
@@ -3870,7 +6317,120 @@
       </w:rPr>
     </w:lvl>
   </w:abstractNum>
-  <w:abstractNum w:abstractNumId="15" w15:restartNumberingAfterBreak="0">
+  <w:abstractNum w:abstractNumId="21" w15:restartNumberingAfterBreak="0">
+    <w:nsid w:val="34FD1EB3"/>
+    <w:multiLevelType w:val="multilevel"/>
+    <w:tmpl w:val="BF8AAC70"/>
+    <w:lvl w:ilvl="0">
+      <w:start w:val="1"/>
+      <w:numFmt w:val="decimal"/>
+      <w:lvlText w:val="%1."/>
+      <w:lvlJc w:val="left"/>
+      <w:pPr>
+        <w:tabs>
+          <w:tab w:val="num" w:pos="720"/>
+        </w:tabs>
+        <w:ind w:left="720" w:hanging="360"/>
+      </w:pPr>
+    </w:lvl>
+    <w:lvl w:ilvl="1" w:tentative="1">
+      <w:start w:val="1"/>
+      <w:numFmt w:val="decimal"/>
+      <w:lvlText w:val="%2."/>
+      <w:lvlJc w:val="left"/>
+      <w:pPr>
+        <w:tabs>
+          <w:tab w:val="num" w:pos="1440"/>
+        </w:tabs>
+        <w:ind w:left="1440" w:hanging="360"/>
+      </w:pPr>
+    </w:lvl>
+    <w:lvl w:ilvl="2" w:tentative="1">
+      <w:start w:val="1"/>
+      <w:numFmt w:val="decimal"/>
+      <w:lvlText w:val="%3."/>
+      <w:lvlJc w:val="left"/>
+      <w:pPr>
+        <w:tabs>
+          <w:tab w:val="num" w:pos="2160"/>
+        </w:tabs>
+        <w:ind w:left="2160" w:hanging="360"/>
+      </w:pPr>
+    </w:lvl>
+    <w:lvl w:ilvl="3" w:tentative="1">
+      <w:start w:val="1"/>
+      <w:numFmt w:val="decimal"/>
+      <w:lvlText w:val="%4."/>
+      <w:lvlJc w:val="left"/>
+      <w:pPr>
+        <w:tabs>
+          <w:tab w:val="num" w:pos="2880"/>
+        </w:tabs>
+        <w:ind w:left="2880" w:hanging="360"/>
+      </w:pPr>
+    </w:lvl>
+    <w:lvl w:ilvl="4" w:tentative="1">
+      <w:start w:val="1"/>
+      <w:numFmt w:val="decimal"/>
+      <w:lvlText w:val="%5."/>
+      <w:lvlJc w:val="left"/>
+      <w:pPr>
+        <w:tabs>
+          <w:tab w:val="num" w:pos="3600"/>
+        </w:tabs>
+        <w:ind w:left="3600" w:hanging="360"/>
+      </w:pPr>
+    </w:lvl>
+    <w:lvl w:ilvl="5" w:tentative="1">
+      <w:start w:val="1"/>
+      <w:numFmt w:val="decimal"/>
+      <w:lvlText w:val="%6."/>
+      <w:lvlJc w:val="left"/>
+      <w:pPr>
+        <w:tabs>
+          <w:tab w:val="num" w:pos="4320"/>
+        </w:tabs>
+        <w:ind w:left="4320" w:hanging="360"/>
+      </w:pPr>
+    </w:lvl>
+    <w:lvl w:ilvl="6" w:tentative="1">
+      <w:start w:val="1"/>
+      <w:numFmt w:val="decimal"/>
+      <w:lvlText w:val="%7."/>
+      <w:lvlJc w:val="left"/>
+      <w:pPr>
+        <w:tabs>
+          <w:tab w:val="num" w:pos="5040"/>
+        </w:tabs>
+        <w:ind w:left="5040" w:hanging="360"/>
+      </w:pPr>
+    </w:lvl>
+    <w:lvl w:ilvl="7" w:tentative="1">
+      <w:start w:val="1"/>
+      <w:numFmt w:val="decimal"/>
+      <w:lvlText w:val="%8."/>
+      <w:lvlJc w:val="left"/>
+      <w:pPr>
+        <w:tabs>
+          <w:tab w:val="num" w:pos="5760"/>
+        </w:tabs>
+        <w:ind w:left="5760" w:hanging="360"/>
+      </w:pPr>
+    </w:lvl>
+    <w:lvl w:ilvl="8" w:tentative="1">
+      <w:start w:val="1"/>
+      <w:numFmt w:val="decimal"/>
+      <w:lvlText w:val="%9."/>
+      <w:lvlJc w:val="left"/>
+      <w:pPr>
+        <w:tabs>
+          <w:tab w:val="num" w:pos="6480"/>
+        </w:tabs>
+        <w:ind w:left="6480" w:hanging="360"/>
+      </w:pPr>
+    </w:lvl>
+  </w:abstractNum>
+  <w:abstractNum w:abstractNumId="22" w15:restartNumberingAfterBreak="0">
     <w:nsid w:val="35CA3875"/>
     <w:multiLevelType w:val="hybridMultilevel"/>
     <w:tmpl w:val="667AADFC"/>
@@ -3960,7 +6520,7 @@
       </w:pPr>
     </w:lvl>
   </w:abstractNum>
-  <w:abstractNum w:abstractNumId="16" w15:restartNumberingAfterBreak="0">
+  <w:abstractNum w:abstractNumId="23" w15:restartNumberingAfterBreak="0">
     <w:nsid w:val="3F015507"/>
     <w:multiLevelType w:val="multilevel"/>
     <w:tmpl w:val="86E21E88"/>
@@ -4109,7 +6669,7 @@
       </w:rPr>
     </w:lvl>
   </w:abstractNum>
-  <w:abstractNum w:abstractNumId="17" w15:restartNumberingAfterBreak="0">
+  <w:abstractNum w:abstractNumId="24" w15:restartNumberingAfterBreak="0">
     <w:nsid w:val="421A33E5"/>
     <w:multiLevelType w:val="hybridMultilevel"/>
     <w:tmpl w:val="79AACD52"/>
@@ -4198,7 +6758,7 @@
       </w:pPr>
     </w:lvl>
   </w:abstractNum>
-  <w:abstractNum w:abstractNumId="18" w15:restartNumberingAfterBreak="0">
+  <w:abstractNum w:abstractNumId="25" w15:restartNumberingAfterBreak="0">
     <w:nsid w:val="4511663D"/>
     <w:multiLevelType w:val="hybridMultilevel"/>
     <w:tmpl w:val="7668DFC0"/>
@@ -4287,7 +6847,7 @@
       </w:pPr>
     </w:lvl>
   </w:abstractNum>
-  <w:abstractNum w:abstractNumId="19" w15:restartNumberingAfterBreak="0">
+  <w:abstractNum w:abstractNumId="26" w15:restartNumberingAfterBreak="0">
     <w:nsid w:val="4E8C24E0"/>
     <w:multiLevelType w:val="hybridMultilevel"/>
     <w:tmpl w:val="E21E541A"/>
@@ -4400,7 +6960,7 @@
       </w:rPr>
     </w:lvl>
   </w:abstractNum>
-  <w:abstractNum w:abstractNumId="20" w15:restartNumberingAfterBreak="0">
+  <w:abstractNum w:abstractNumId="27" w15:restartNumberingAfterBreak="0">
     <w:nsid w:val="544C2103"/>
     <w:multiLevelType w:val="hybridMultilevel"/>
     <w:tmpl w:val="2E54A628"/>
@@ -4513,7 +7073,7 @@
       </w:rPr>
     </w:lvl>
   </w:abstractNum>
-  <w:abstractNum w:abstractNumId="21" w15:restartNumberingAfterBreak="0">
+  <w:abstractNum w:abstractNumId="28" w15:restartNumberingAfterBreak="0">
     <w:nsid w:val="563B4C18"/>
     <w:multiLevelType w:val="multilevel"/>
     <w:tmpl w:val="0A884C62"/>
@@ -4626,7 +7186,7 @@
       </w:rPr>
     </w:lvl>
   </w:abstractNum>
-  <w:abstractNum w:abstractNumId="22" w15:restartNumberingAfterBreak="0">
+  <w:abstractNum w:abstractNumId="29" w15:restartNumberingAfterBreak="0">
     <w:nsid w:val="56B82078"/>
     <w:multiLevelType w:val="multilevel"/>
     <w:tmpl w:val="C6F8B7F4"/>
@@ -4741,7 +7301,7 @@
       </w:rPr>
     </w:lvl>
   </w:abstractNum>
-  <w:abstractNum w:abstractNumId="23" w15:restartNumberingAfterBreak="0">
+  <w:abstractNum w:abstractNumId="30" w15:restartNumberingAfterBreak="0">
     <w:nsid w:val="58601235"/>
     <w:multiLevelType w:val="multilevel"/>
     <w:tmpl w:val="3FB8DA1C"/>
@@ -4890,7 +7450,7 @@
       </w:rPr>
     </w:lvl>
   </w:abstractNum>
-  <w:abstractNum w:abstractNumId="24" w15:restartNumberingAfterBreak="0">
+  <w:abstractNum w:abstractNumId="31" w15:restartNumberingAfterBreak="0">
     <w:nsid w:val="587262F8"/>
     <w:multiLevelType w:val="multilevel"/>
     <w:tmpl w:val="FA7E4BD0"/>
@@ -5039,7 +7599,7 @@
       </w:rPr>
     </w:lvl>
   </w:abstractNum>
-  <w:abstractNum w:abstractNumId="25" w15:restartNumberingAfterBreak="0">
+  <w:abstractNum w:abstractNumId="32" w15:restartNumberingAfterBreak="0">
     <w:nsid w:val="5ACB557F"/>
     <w:multiLevelType w:val="hybridMultilevel"/>
     <w:tmpl w:val="47CA5D66"/>
@@ -5125,7 +7685,7 @@
       </w:pPr>
     </w:lvl>
   </w:abstractNum>
-  <w:abstractNum w:abstractNumId="26" w15:restartNumberingAfterBreak="0">
+  <w:abstractNum w:abstractNumId="33" w15:restartNumberingAfterBreak="0">
     <w:nsid w:val="5DE970B6"/>
     <w:multiLevelType w:val="hybridMultilevel"/>
     <w:tmpl w:val="BD3C5152"/>
@@ -5215,7 +7775,7 @@
       </w:pPr>
     </w:lvl>
   </w:abstractNum>
-  <w:abstractNum w:abstractNumId="27" w15:restartNumberingAfterBreak="0">
+  <w:abstractNum w:abstractNumId="34" w15:restartNumberingAfterBreak="0">
     <w:nsid w:val="5F3112FC"/>
     <w:multiLevelType w:val="hybridMultilevel"/>
     <w:tmpl w:val="136C7E32"/>
@@ -5328,7 +7888,7 @@
       </w:rPr>
     </w:lvl>
   </w:abstractNum>
-  <w:abstractNum w:abstractNumId="28" w15:restartNumberingAfterBreak="0">
+  <w:abstractNum w:abstractNumId="35" w15:restartNumberingAfterBreak="0">
     <w:nsid w:val="610B36EA"/>
     <w:multiLevelType w:val="hybridMultilevel"/>
     <w:tmpl w:val="E1DEC3AC"/>
@@ -5429,7 +7989,120 @@
       </w:pPr>
     </w:lvl>
   </w:abstractNum>
-  <w:abstractNum w:abstractNumId="29" w15:restartNumberingAfterBreak="0">
+  <w:abstractNum w:abstractNumId="36" w15:restartNumberingAfterBreak="0">
+    <w:nsid w:val="6C2E7A4D"/>
+    <w:multiLevelType w:val="multilevel"/>
+    <w:tmpl w:val="421A3EC2"/>
+    <w:lvl w:ilvl="0">
+      <w:start w:val="1"/>
+      <w:numFmt w:val="decimal"/>
+      <w:lvlText w:val="%1."/>
+      <w:lvlJc w:val="left"/>
+      <w:pPr>
+        <w:tabs>
+          <w:tab w:val="num" w:pos="720"/>
+        </w:tabs>
+        <w:ind w:left="720" w:hanging="360"/>
+      </w:pPr>
+    </w:lvl>
+    <w:lvl w:ilvl="1" w:tentative="1">
+      <w:start w:val="1"/>
+      <w:numFmt w:val="decimal"/>
+      <w:lvlText w:val="%2."/>
+      <w:lvlJc w:val="left"/>
+      <w:pPr>
+        <w:tabs>
+          <w:tab w:val="num" w:pos="1440"/>
+        </w:tabs>
+        <w:ind w:left="1440" w:hanging="360"/>
+      </w:pPr>
+    </w:lvl>
+    <w:lvl w:ilvl="2" w:tentative="1">
+      <w:start w:val="1"/>
+      <w:numFmt w:val="decimal"/>
+      <w:lvlText w:val="%3."/>
+      <w:lvlJc w:val="left"/>
+      <w:pPr>
+        <w:tabs>
+          <w:tab w:val="num" w:pos="2160"/>
+        </w:tabs>
+        <w:ind w:left="2160" w:hanging="360"/>
+      </w:pPr>
+    </w:lvl>
+    <w:lvl w:ilvl="3" w:tentative="1">
+      <w:start w:val="1"/>
+      <w:numFmt w:val="decimal"/>
+      <w:lvlText w:val="%4."/>
+      <w:lvlJc w:val="left"/>
+      <w:pPr>
+        <w:tabs>
+          <w:tab w:val="num" w:pos="2880"/>
+        </w:tabs>
+        <w:ind w:left="2880" w:hanging="360"/>
+      </w:pPr>
+    </w:lvl>
+    <w:lvl w:ilvl="4" w:tentative="1">
+      <w:start w:val="1"/>
+      <w:numFmt w:val="decimal"/>
+      <w:lvlText w:val="%5."/>
+      <w:lvlJc w:val="left"/>
+      <w:pPr>
+        <w:tabs>
+          <w:tab w:val="num" w:pos="3600"/>
+        </w:tabs>
+        <w:ind w:left="3600" w:hanging="360"/>
+      </w:pPr>
+    </w:lvl>
+    <w:lvl w:ilvl="5" w:tentative="1">
+      <w:start w:val="1"/>
+      <w:numFmt w:val="decimal"/>
+      <w:lvlText w:val="%6."/>
+      <w:lvlJc w:val="left"/>
+      <w:pPr>
+        <w:tabs>
+          <w:tab w:val="num" w:pos="4320"/>
+        </w:tabs>
+        <w:ind w:left="4320" w:hanging="360"/>
+      </w:pPr>
+    </w:lvl>
+    <w:lvl w:ilvl="6" w:tentative="1">
+      <w:start w:val="1"/>
+      <w:numFmt w:val="decimal"/>
+      <w:lvlText w:val="%7."/>
+      <w:lvlJc w:val="left"/>
+      <w:pPr>
+        <w:tabs>
+          <w:tab w:val="num" w:pos="5040"/>
+        </w:tabs>
+        <w:ind w:left="5040" w:hanging="360"/>
+      </w:pPr>
+    </w:lvl>
+    <w:lvl w:ilvl="7" w:tentative="1">
+      <w:start w:val="1"/>
+      <w:numFmt w:val="decimal"/>
+      <w:lvlText w:val="%8."/>
+      <w:lvlJc w:val="left"/>
+      <w:pPr>
+        <w:tabs>
+          <w:tab w:val="num" w:pos="5760"/>
+        </w:tabs>
+        <w:ind w:left="5760" w:hanging="360"/>
+      </w:pPr>
+    </w:lvl>
+    <w:lvl w:ilvl="8" w:tentative="1">
+      <w:start w:val="1"/>
+      <w:numFmt w:val="decimal"/>
+      <w:lvlText w:val="%9."/>
+      <w:lvlJc w:val="left"/>
+      <w:pPr>
+        <w:tabs>
+          <w:tab w:val="num" w:pos="6480"/>
+        </w:tabs>
+        <w:ind w:left="6480" w:hanging="360"/>
+      </w:pPr>
+    </w:lvl>
+  </w:abstractNum>
+  <w:abstractNum w:abstractNumId="37" w15:restartNumberingAfterBreak="0">
     <w:nsid w:val="6F95007F"/>
     <w:multiLevelType w:val="multilevel"/>
     <w:tmpl w:val="77A67D9A"/>
@@ -5578,7 +8251,7 @@
       </w:rPr>
     </w:lvl>
   </w:abstractNum>
-  <w:abstractNum w:abstractNumId="30" w15:restartNumberingAfterBreak="0">
+  <w:abstractNum w:abstractNumId="38" w15:restartNumberingAfterBreak="0">
     <w:nsid w:val="71301C39"/>
     <w:multiLevelType w:val="hybridMultilevel"/>
     <w:tmpl w:val="D8B671DC"/>
@@ -5691,7 +8364,156 @@
       </w:rPr>
     </w:lvl>
   </w:abstractNum>
-  <w:abstractNum w:abstractNumId="31" w15:restartNumberingAfterBreak="0">
+  <w:abstractNum w:abstractNumId="39" w15:restartNumberingAfterBreak="0">
+    <w:nsid w:val="721F722B"/>
+    <w:multiLevelType w:val="multilevel"/>
+    <w:tmpl w:val="562C54A4"/>
+    <w:lvl w:ilvl="0">
+      <w:start w:val="1"/>
+      <w:numFmt w:val="bullet"/>
+      <w:lvlText w:val=""/>
+      <w:lvlJc w:val="left"/>
+      <w:pPr>
+        <w:tabs>
+          <w:tab w:val="num" w:pos="720"/>
+        </w:tabs>
+        <w:ind w:left="720" w:hanging="360"/>
+      </w:pPr>
+      <w:rPr>
+        <w:rFonts w:ascii="Symbol" w:hAnsi="Symbol" w:hint="default"/>
+        <w:sz w:val="20"/>
+      </w:rPr>
+    </w:lvl>
+    <w:lvl w:ilvl="1" w:tentative="1">
+      <w:start w:val="1"/>
+      <w:numFmt w:val="bullet"/>
+      <w:lvlText w:val="o"/>
+      <w:lvlJc w:val="left"/>
+      <w:pPr>
+        <w:tabs>
+          <w:tab w:val="num" w:pos="1440"/>
+        </w:tabs>
+        <w:ind w:left="1440" w:hanging="360"/>
+      </w:pPr>
+      <w:rPr>
+        <w:rFonts w:ascii="Courier New" w:hAnsi="Courier New" w:hint="default"/>
+        <w:sz w:val="20"/>
+      </w:rPr>
+    </w:lvl>
+    <w:lvl w:ilvl="2" w:tentative="1">
+      <w:start w:val="1"/>
+      <w:numFmt w:val="bullet"/>
+      <w:lvlText w:val=""/>
+      <w:lvlJc w:val="left"/>
+      <w:pPr>
+        <w:tabs>
+          <w:tab w:val="num" w:pos="2160"/>
+        </w:tabs>
+        <w:ind w:left="2160" w:hanging="360"/>
+      </w:pPr>
+      <w:rPr>
+        <w:rFonts w:ascii="Wingdings" w:hAnsi="Wingdings" w:hint="default"/>
+        <w:sz w:val="20"/>
+      </w:rPr>
+    </w:lvl>
+    <w:lvl w:ilvl="3" w:tentative="1">
+      <w:start w:val="1"/>
+      <w:numFmt w:val="bullet"/>
+      <w:lvlText w:val=""/>
+      <w:lvlJc w:val="left"/>
+      <w:pPr>
+        <w:tabs>
+          <w:tab w:val="num" w:pos="2880"/>
+        </w:tabs>
+        <w:ind w:left="2880" w:hanging="360"/>
+      </w:pPr>
+      <w:rPr>
+        <w:rFonts w:ascii="Wingdings" w:hAnsi="Wingdings" w:hint="default"/>
+        <w:sz w:val="20"/>
+      </w:rPr>
+    </w:lvl>
+    <w:lvl w:ilvl="4" w:tentative="1">
+      <w:start w:val="1"/>
+      <w:numFmt w:val="bullet"/>
+      <w:lvlText w:val=""/>
+      <w:lvlJc w:val="left"/>
+      <w:pPr>
+        <w:tabs>
+          <w:tab w:val="num" w:pos="3600"/>
+        </w:tabs>
+        <w:ind w:left="3600" w:hanging="360"/>
+      </w:pPr>
+      <w:rPr>
+        <w:rFonts w:ascii="Wingdings" w:hAnsi="Wingdings" w:hint="default"/>
+        <w:sz w:val="20"/>
+      </w:rPr>
+    </w:lvl>
+    <w:lvl w:ilvl="5" w:tentative="1">
+      <w:start w:val="1"/>
+      <w:numFmt w:val="bullet"/>
+      <w:lvlText w:val=""/>
+      <w:lvlJc w:val="left"/>
+      <w:pPr>
+        <w:tabs>
+          <w:tab w:val="num" w:pos="4320"/>
+        </w:tabs>
+        <w:ind w:left="4320" w:hanging="360"/>
+      </w:pPr>
+      <w:rPr>
+        <w:rFonts w:ascii="Wingdings" w:hAnsi="Wingdings" w:hint="default"/>
+        <w:sz w:val="20"/>
+      </w:rPr>
+    </w:lvl>
+    <w:lvl w:ilvl="6" w:tentative="1">
+      <w:start w:val="1"/>
+      <w:numFmt w:val="bullet"/>
+      <w:lvlText w:val=""/>
+      <w:lvlJc w:val="left"/>
+      <w:pPr>
+        <w:tabs>
+          <w:tab w:val="num" w:pos="5040"/>
+        </w:tabs>
+        <w:ind w:left="5040" w:hanging="360"/>
+      </w:pPr>
+      <w:rPr>
+        <w:rFonts w:ascii="Wingdings" w:hAnsi="Wingdings" w:hint="default"/>
+        <w:sz w:val="20"/>
+      </w:rPr>
+    </w:lvl>
+    <w:lvl w:ilvl="7" w:tentative="1">
+      <w:start w:val="1"/>
+      <w:numFmt w:val="bullet"/>
+      <w:lvlText w:val=""/>
+      <w:lvlJc w:val="left"/>
+      <w:pPr>
+        <w:tabs>
+          <w:tab w:val="num" w:pos="5760"/>
+        </w:tabs>
+        <w:ind w:left="5760" w:hanging="360"/>
+      </w:pPr>
+      <w:rPr>
+        <w:rFonts w:ascii="Wingdings" w:hAnsi="Wingdings" w:hint="default"/>
+        <w:sz w:val="20"/>
+      </w:rPr>
+    </w:lvl>
+    <w:lvl w:ilvl="8" w:tentative="1">
+      <w:start w:val="1"/>
+      <w:numFmt w:val="bullet"/>
+      <w:lvlText w:val=""/>
+      <w:lvlJc w:val="left"/>
+      <w:pPr>
+        <w:tabs>
+          <w:tab w:val="num" w:pos="6480"/>
+        </w:tabs>
+        <w:ind w:left="6480" w:hanging="360"/>
+      </w:pPr>
+      <w:rPr>
+        <w:rFonts w:ascii="Wingdings" w:hAnsi="Wingdings" w:hint="default"/>
+        <w:sz w:val="20"/>
+      </w:rPr>
+    </w:lvl>
+  </w:abstractNum>
+  <w:abstractNum w:abstractNumId="40" w15:restartNumberingAfterBreak="0">
     <w:nsid w:val="7385147C"/>
     <w:multiLevelType w:val="multilevel"/>
     <w:tmpl w:val="0DF00B58"/>
@@ -5840,7 +8662,7 @@
       </w:rPr>
     </w:lvl>
   </w:abstractNum>
-  <w:abstractNum w:abstractNumId="32" w15:restartNumberingAfterBreak="0">
+  <w:abstractNum w:abstractNumId="41" w15:restartNumberingAfterBreak="0">
     <w:nsid w:val="77B0725D"/>
     <w:multiLevelType w:val="multilevel"/>
     <w:tmpl w:val="4A7E42DE"/>
@@ -5989,7 +8811,7 @@
       </w:rPr>
     </w:lvl>
   </w:abstractNum>
-  <w:abstractNum w:abstractNumId="33" w15:restartNumberingAfterBreak="0">
+  <w:abstractNum w:abstractNumId="42" w15:restartNumberingAfterBreak="0">
     <w:nsid w:val="7BED15C5"/>
     <w:multiLevelType w:val="hybridMultilevel"/>
     <w:tmpl w:val="91C82028"/>
@@ -6079,7 +8901,7 @@
       </w:pPr>
     </w:lvl>
   </w:abstractNum>
-  <w:abstractNum w:abstractNumId="34" w15:restartNumberingAfterBreak="0">
+  <w:abstractNum w:abstractNumId="43" w15:restartNumberingAfterBreak="0">
     <w:nsid w:val="7D6847F9"/>
     <w:multiLevelType w:val="multilevel"/>
     <w:tmpl w:val="DDC8FF8A"/>
@@ -6213,109 +9035,136 @@
     </w:lvl>
   </w:abstractNum>
   <w:num w:numId="1" w16cid:durableId="1454010081">
+    <w:abstractNumId w:val="29"/>
+  </w:num>
+  <w:num w:numId="2" w16cid:durableId="297883405">
+    <w:abstractNumId w:val="32"/>
+  </w:num>
+  <w:num w:numId="3" w16cid:durableId="151720973">
+    <w:abstractNumId w:val="35"/>
+  </w:num>
+  <w:num w:numId="4" w16cid:durableId="807236645">
+    <w:abstractNumId w:val="43"/>
+  </w:num>
+  <w:num w:numId="5" w16cid:durableId="1978759258">
+    <w:abstractNumId w:val="34"/>
+  </w:num>
+  <w:num w:numId="6" w16cid:durableId="1077168458">
+    <w:abstractNumId w:val="13"/>
+  </w:num>
+  <w:num w:numId="7" w16cid:durableId="162548488">
+    <w:abstractNumId w:val="25"/>
+  </w:num>
+  <w:num w:numId="8" w16cid:durableId="1476987596">
+    <w:abstractNumId w:val="27"/>
+  </w:num>
+  <w:num w:numId="9" w16cid:durableId="1799369767">
+    <w:abstractNumId w:val="38"/>
+  </w:num>
+  <w:num w:numId="10" w16cid:durableId="1058626483">
+    <w:abstractNumId w:val="11"/>
+  </w:num>
+  <w:num w:numId="11" w16cid:durableId="1478767825">
+    <w:abstractNumId w:val="42"/>
+  </w:num>
+  <w:num w:numId="12" w16cid:durableId="415440285">
+    <w:abstractNumId w:val="33"/>
+  </w:num>
+  <w:num w:numId="13" w16cid:durableId="1323510480">
     <w:abstractNumId w:val="22"/>
   </w:num>
-  <w:num w:numId="2" w16cid:durableId="297883405">
-    <w:abstractNumId w:val="25"/>
+  <w:num w:numId="14" w16cid:durableId="102266337">
+    <w:abstractNumId w:val="4"/>
   </w:num>
-  <w:num w:numId="3" w16cid:durableId="151720973">
+  <w:num w:numId="15" w16cid:durableId="1387874766">
+    <w:abstractNumId w:val="17"/>
+  </w:num>
+  <w:num w:numId="16" w16cid:durableId="1760174423">
+    <w:abstractNumId w:val="24"/>
+  </w:num>
+  <w:num w:numId="17" w16cid:durableId="768041857">
+    <w:abstractNumId w:val="3"/>
+  </w:num>
+  <w:num w:numId="18" w16cid:durableId="1455096245">
+    <w:abstractNumId w:val="8"/>
+  </w:num>
+  <w:num w:numId="19" w16cid:durableId="1080754969">
+    <w:abstractNumId w:val="19"/>
+  </w:num>
+  <w:num w:numId="20" w16cid:durableId="1848866434">
     <w:abstractNumId w:val="28"/>
   </w:num>
-  <w:num w:numId="4" w16cid:durableId="807236645">
-    <w:abstractNumId w:val="34"/>
-  </w:num>
-  <w:num w:numId="5" w16cid:durableId="1978759258">
-    <w:abstractNumId w:val="27"/>
-  </w:num>
-  <w:num w:numId="6" w16cid:durableId="1077168458">
-    <w:abstractNumId w:val="7"/>
-  </w:num>
-  <w:num w:numId="7" w16cid:durableId="162548488">
-    <w:abstractNumId w:val="18"/>
-  </w:num>
-  <w:num w:numId="8" w16cid:durableId="1476987596">
-    <w:abstractNumId w:val="20"/>
-  </w:num>
-  <w:num w:numId="9" w16cid:durableId="1799369767">
+  <w:num w:numId="21" w16cid:durableId="137574361">
     <w:abstractNumId w:val="30"/>
   </w:num>
-  <w:num w:numId="10" w16cid:durableId="1058626483">
-    <w:abstractNumId w:val="6"/>
-  </w:num>
-  <w:num w:numId="11" w16cid:durableId="1478767825">
-    <w:abstractNumId w:val="33"/>
-  </w:num>
-  <w:num w:numId="12" w16cid:durableId="415440285">
-    <w:abstractNumId w:val="26"/>
-  </w:num>
-  <w:num w:numId="13" w16cid:durableId="1323510480">
-    <w:abstractNumId w:val="15"/>
-  </w:num>
-  <w:num w:numId="14" w16cid:durableId="102266337">
-    <w:abstractNumId w:val="3"/>
-  </w:num>
-  <w:num w:numId="15" w16cid:durableId="1387874766">
-    <w:abstractNumId w:val="11"/>
-  </w:num>
-  <w:num w:numId="16" w16cid:durableId="1760174423">
-    <w:abstractNumId w:val="17"/>
-  </w:num>
-  <w:num w:numId="17" w16cid:durableId="768041857">
-    <w:abstractNumId w:val="2"/>
-  </w:num>
-  <w:num w:numId="18" w16cid:durableId="1455096245">
-    <w:abstractNumId w:val="5"/>
-  </w:num>
-  <w:num w:numId="19" w16cid:durableId="1080754969">
-    <w:abstractNumId w:val="13"/>
-  </w:num>
-  <w:num w:numId="20" w16cid:durableId="1848866434">
-    <w:abstractNumId w:val="21"/>
-  </w:num>
-  <w:num w:numId="21" w16cid:durableId="137574361">
+  <w:num w:numId="22" w16cid:durableId="1240366149">
     <w:abstractNumId w:val="23"/>
-  </w:num>
-  <w:num w:numId="22" w16cid:durableId="1240366149">
-    <w:abstractNumId w:val="16"/>
   </w:num>
   <w:num w:numId="23" w16cid:durableId="1039360866">
     <w:abstractNumId w:val="0"/>
   </w:num>
   <w:num w:numId="24" w16cid:durableId="1488672578">
+    <w:abstractNumId w:val="40"/>
+  </w:num>
+  <w:num w:numId="25" w16cid:durableId="72091252">
+    <w:abstractNumId w:val="20"/>
+  </w:num>
+  <w:num w:numId="26" w16cid:durableId="1350792825">
+    <w:abstractNumId w:val="26"/>
+  </w:num>
+  <w:num w:numId="27" w16cid:durableId="1340044857">
+    <w:abstractNumId w:val="18"/>
+  </w:num>
+  <w:num w:numId="28" w16cid:durableId="1708796352">
+    <w:abstractNumId w:val="14"/>
+  </w:num>
+  <w:num w:numId="29" w16cid:durableId="1498961499">
+    <w:abstractNumId w:val="7"/>
+  </w:num>
+  <w:num w:numId="30" w16cid:durableId="797068779">
+    <w:abstractNumId w:val="15"/>
+  </w:num>
+  <w:num w:numId="31" w16cid:durableId="1994983998">
+    <w:abstractNumId w:val="37"/>
+  </w:num>
+  <w:num w:numId="32" w16cid:durableId="1792478486">
+    <w:abstractNumId w:val="16"/>
+  </w:num>
+  <w:num w:numId="33" w16cid:durableId="1437017517">
+    <w:abstractNumId w:val="41"/>
+  </w:num>
+  <w:num w:numId="34" w16cid:durableId="1748766222">
+    <w:abstractNumId w:val="2"/>
+  </w:num>
+  <w:num w:numId="35" w16cid:durableId="1839881332">
     <w:abstractNumId w:val="31"/>
   </w:num>
-  <w:num w:numId="25" w16cid:durableId="72091252">
-    <w:abstractNumId w:val="14"/>
+  <w:num w:numId="36" w16cid:durableId="1199582731">
+    <w:abstractNumId w:val="9"/>
   </w:num>
-  <w:num w:numId="26" w16cid:durableId="1350792825">
-    <w:abstractNumId w:val="19"/>
+  <w:num w:numId="37" w16cid:durableId="1759905659">
+    <w:abstractNumId w:val="5"/>
   </w:num>
-  <w:num w:numId="27" w16cid:durableId="1340044857">
+  <w:num w:numId="38" w16cid:durableId="1361973779">
     <w:abstractNumId w:val="12"/>
   </w:num>
-  <w:num w:numId="28" w16cid:durableId="1708796352">
-    <w:abstractNumId w:val="8"/>
-  </w:num>
-  <w:num w:numId="29" w16cid:durableId="1498961499">
-    <w:abstractNumId w:val="4"/>
-  </w:num>
-  <w:num w:numId="30" w16cid:durableId="797068779">
-    <w:abstractNumId w:val="9"/>
-  </w:num>
-  <w:num w:numId="31" w16cid:durableId="1994983998">
-    <w:abstractNumId w:val="29"/>
-  </w:num>
-  <w:num w:numId="32" w16cid:durableId="1792478486">
+  <w:num w:numId="39" w16cid:durableId="214583880">
     <w:abstractNumId w:val="10"/>
   </w:num>
-  <w:num w:numId="33" w16cid:durableId="1437017517">
-    <w:abstractNumId w:val="32"/>
+  <w:num w:numId="40" w16cid:durableId="1343899558">
+    <w:abstractNumId w:val="39"/>
   </w:num>
-  <w:num w:numId="34" w16cid:durableId="1748766222">
+  <w:num w:numId="41" w16cid:durableId="1549489980">
+    <w:abstractNumId w:val="21"/>
+  </w:num>
+  <w:num w:numId="42" w16cid:durableId="359209778">
+    <w:abstractNumId w:val="36"/>
+  </w:num>
+  <w:num w:numId="43" w16cid:durableId="464391026">
     <w:abstractNumId w:val="1"/>
   </w:num>
-  <w:num w:numId="35" w16cid:durableId="1839881332">
-    <w:abstractNumId w:val="24"/>
+  <w:num w:numId="44" w16cid:durableId="934481359">
+    <w:abstractNumId w:val="6"/>
   </w:num>
 </w:numbering>
 </file>
@@ -6924,7 +9773,6 @@
   <w:style w:type="character" w:default="1" w:styleId="DefaultParagraphFont">
     <w:name w:val="Default Paragraph Font"/>
     <w:uiPriority w:val="1"/>
-    <w:semiHidden/>
     <w:unhideWhenUsed/>
   </w:style>
   <w:style w:type="table" w:default="1" w:styleId="TableNormal">
@@ -7464,6 +10312,7 @@
     <w:rsid w:val="0027192B"/>
     <w:rsid w:val="00376447"/>
     <w:rsid w:val="003C6ECC"/>
+    <w:rsid w:val="004A5E2A"/>
     <w:rsid w:val="004C333C"/>
     <w:rsid w:val="005214EC"/>
     <w:rsid w:val="0053457C"/>
@@ -7475,6 +10324,7 @@
     <w:rsid w:val="007B485C"/>
     <w:rsid w:val="007D0ED7"/>
     <w:rsid w:val="0085193F"/>
+    <w:rsid w:val="008641EF"/>
     <w:rsid w:val="008E7983"/>
     <w:rsid w:val="00987F3A"/>
     <w:rsid w:val="009C35D6"/>

</xml_diff>